<commit_message>
update: new PWA files
</commit_message>
<xml_diff>
--- a/🧭 Дорожня карта.docx
+++ b/🧭 Дорожня карта.docx
@@ -112,7 +112,7 @@
           <w:lang w:eastAsia="ru-RU"/>
         </w:rPr>
         <w:pict w14:anchorId="6368B1A8">
-          <v:rect id="_x0000_i1026" style="width:0;height:1.5pt" o:hralign="center" o:hrstd="t" o:hr="t" fillcolor="#a0a0a0" stroked="f"/>
+          <v:rect id="_x0000_i1025" style="width:0;height:1.5pt" o:hralign="center" o:hrstd="t" o:hr="t" fillcolor="#a0a0a0" stroked="f"/>
         </w:pict>
       </w:r>
     </w:p>
@@ -642,7 +642,7 @@
           <w:lang w:eastAsia="ru-RU"/>
         </w:rPr>
         <w:pict w14:anchorId="4274701E">
-          <v:rect id="_x0000_i1027" style="width:0;height:1.5pt" o:hralign="center" o:hrstd="t" o:hr="t" fillcolor="#a0a0a0" stroked="f"/>
+          <v:rect id="_x0000_i1026" style="width:0;height:1.5pt" o:hralign="center" o:hrstd="t" o:hr="t" fillcolor="#a0a0a0" stroked="f"/>
         </w:pict>
       </w:r>
     </w:p>
@@ -922,7 +922,7 @@
           <w:lang w:eastAsia="ru-RU"/>
         </w:rPr>
         <w:pict w14:anchorId="07FE12EE">
-          <v:rect id="_x0000_i1028" style="width:0;height:1.5pt" o:hralign="center" o:hrstd="t" o:hr="t" fillcolor="#a0a0a0" stroked="f"/>
+          <v:rect id="_x0000_i1027" style="width:0;height:1.5pt" o:hralign="center" o:hrstd="t" o:hr="t" fillcolor="#a0a0a0" stroked="f"/>
         </w:pict>
       </w:r>
     </w:p>
@@ -1383,20 +1383,9 @@
           <w:lang w:eastAsia="ru-RU"/>
         </w:rPr>
         <w:pict w14:anchorId="3928FABF">
-          <v:rect id="_x0000_i1254" style="width:0;height:1.5pt" o:hralign="center" o:hrstd="t" o:hr="t" fillcolor="#a0a0a0" stroked="f"/>
+          <v:rect id="_x0000_i1028" style="width:0;height:1.5pt" o:hralign="center" o:hrstd="t" o:hr="t" fillcolor="#a0a0a0" stroked="f"/>
         </w:pict>
       </w:r>
-    </w:p>
-    <w:p>
-      <w:pPr>
-        <w:spacing w:before="100" w:beforeAutospacing="1" w:after="100" w:afterAutospacing="1" w:line="240" w:lineRule="auto"/>
-        <w:rPr>
-          <w:rFonts w:ascii="Times New Roman" w:eastAsia="Times New Roman" w:hAnsi="Times New Roman" w:cs="Times New Roman"/>
-          <w:sz w:val="24"/>
-          <w:szCs w:val="24"/>
-          <w:lang w:eastAsia="ru-RU"/>
-        </w:rPr>
-      </w:pPr>
       <w:r>
         <w:rPr>
           <w:rFonts w:ascii="Segoe UI Emoji" w:eastAsia="Times New Roman" w:hAnsi="Segoe UI Emoji" w:cs="Segoe UI Emoji"/>
@@ -1454,6 +1443,870 @@
         </w:rPr>
         <w:t>.</w:t>
       </w:r>
+      <w:r>
+        <w:rPr>
+          <w:rFonts w:ascii="Times New Roman" w:eastAsia="Times New Roman" w:hAnsi="Times New Roman" w:cs="Times New Roman"/>
+          <w:sz w:val="24"/>
+          <w:szCs w:val="24"/>
+          <w:lang w:eastAsia="ru-RU"/>
+        </w:rPr>
+        <w:br/>
+      </w:r>
+    </w:p>
+    <w:p>
+      <w:pPr>
+        <w:pStyle w:val="a3"/>
+        <w:rPr>
+          <w:u w:val="single"/>
+          <w:lang w:val="uk-UA"/>
+        </w:rPr>
+      </w:pPr>
+      <w:r>
+        <w:rPr>
+          <w:b/>
+          <w:bCs/>
+          <w:u w:val="single"/>
+          <w:lang w:val="uk-UA"/>
+        </w:rPr>
+        <w:lastRenderedPageBreak/>
+        <w:t>!!!П</w:t>
+      </w:r>
+      <w:r>
+        <w:rPr>
+          <w:b/>
+          <w:bCs/>
+          <w:u w:val="single"/>
+        </w:rPr>
+        <w:t>ослідовність дій</w:t>
+      </w:r>
+      <w:r>
+        <w:rPr>
+          <w:u w:val="single"/>
+        </w:rPr>
+        <w:t>, щоб оновити код у GitHub та автоматично отримати новий деплой на Vercel</w:t>
+      </w:r>
+      <w:r>
+        <w:rPr>
+          <w:u w:val="single"/>
+          <w:lang w:val="uk-UA"/>
+        </w:rPr>
+        <w:t>!</w:t>
+      </w:r>
+    </w:p>
+    <w:p>
+      <w:pPr>
+        <w:spacing w:before="100" w:beforeAutospacing="1" w:after="100" w:afterAutospacing="1" w:line="240" w:lineRule="auto"/>
+        <w:outlineLvl w:val="2"/>
+        <w:rPr>
+          <w:rFonts w:ascii="Times New Roman" w:eastAsia="Times New Roman" w:hAnsi="Times New Roman" w:cs="Times New Roman"/>
+          <w:b/>
+          <w:bCs/>
+          <w:sz w:val="27"/>
+          <w:szCs w:val="27"/>
+          <w:lang w:eastAsia="ru-RU"/>
+        </w:rPr>
+      </w:pPr>
+      <w:r>
+        <w:rPr>
+          <w:rFonts w:ascii="Segoe UI Emoji" w:eastAsia="Times New Roman" w:hAnsi="Segoe UI Emoji" w:cs="Segoe UI Emoji"/>
+          <w:b/>
+          <w:bCs/>
+          <w:sz w:val="27"/>
+          <w:szCs w:val="27"/>
+          <w:lang w:eastAsia="ru-RU"/>
+        </w:rPr>
+        <w:t>✅</w:t>
+      </w:r>
+      <w:r>
+        <w:rPr>
+          <w:rFonts w:ascii="Times New Roman" w:eastAsia="Times New Roman" w:hAnsi="Times New Roman" w:cs="Times New Roman"/>
+          <w:b/>
+          <w:bCs/>
+          <w:sz w:val="27"/>
+          <w:szCs w:val="27"/>
+          <w:lang w:eastAsia="ru-RU"/>
+        </w:rPr>
+        <w:t xml:space="preserve"> 1. Перевіряєш зміни локально</w:t>
+      </w:r>
+    </w:p>
+    <w:p>
+      <w:pPr>
+        <w:spacing w:before="100" w:beforeAutospacing="1" w:after="100" w:afterAutospacing="1" w:line="240" w:lineRule="auto"/>
+        <w:rPr>
+          <w:rFonts w:ascii="Times New Roman" w:eastAsia="Times New Roman" w:hAnsi="Times New Roman" w:cs="Times New Roman"/>
+          <w:sz w:val="24"/>
+          <w:szCs w:val="24"/>
+          <w:lang w:eastAsia="ru-RU"/>
+        </w:rPr>
+      </w:pPr>
+      <w:r>
+        <w:rPr>
+          <w:rFonts w:ascii="Times New Roman" w:eastAsia="Times New Roman" w:hAnsi="Times New Roman" w:cs="Times New Roman"/>
+          <w:sz w:val="24"/>
+          <w:szCs w:val="24"/>
+          <w:lang w:eastAsia="ru-RU"/>
+        </w:rPr>
+        <w:t>У терміналі (в корені проєкту):</w:t>
+      </w:r>
+    </w:p>
+    <w:p>
+      <w:pPr>
+        <w:tabs>
+          <w:tab w:val="left" w:pos="916"/>
+          <w:tab w:val="left" w:pos="1832"/>
+          <w:tab w:val="left" w:pos="2748"/>
+          <w:tab w:val="left" w:pos="3664"/>
+          <w:tab w:val="left" w:pos="4580"/>
+          <w:tab w:val="left" w:pos="5496"/>
+          <w:tab w:val="left" w:pos="6412"/>
+          <w:tab w:val="left" w:pos="7328"/>
+          <w:tab w:val="left" w:pos="8244"/>
+          <w:tab w:val="left" w:pos="9160"/>
+          <w:tab w:val="left" w:pos="10076"/>
+          <w:tab w:val="left" w:pos="10992"/>
+          <w:tab w:val="left" w:pos="11908"/>
+          <w:tab w:val="left" w:pos="12824"/>
+          <w:tab w:val="left" w:pos="13740"/>
+          <w:tab w:val="left" w:pos="14656"/>
+        </w:tabs>
+        <w:spacing w:after="0" w:line="240" w:lineRule="auto"/>
+        <w:rPr>
+          <w:rFonts w:ascii="Courier New" w:eastAsia="Times New Roman" w:hAnsi="Courier New" w:cs="Courier New"/>
+          <w:sz w:val="20"/>
+          <w:szCs w:val="20"/>
+          <w:lang w:eastAsia="ru-RU"/>
+        </w:rPr>
+      </w:pPr>
+      <w:r>
+        <w:rPr>
+          <w:rFonts w:ascii="Courier New" w:eastAsia="Times New Roman" w:hAnsi="Courier New" w:cs="Courier New"/>
+          <w:sz w:val="20"/>
+          <w:szCs w:val="20"/>
+          <w:lang w:eastAsia="ru-RU"/>
+        </w:rPr>
+        <w:t>git status</w:t>
+      </w:r>
+    </w:p>
+    <w:p>
+      <w:pPr>
+        <w:spacing w:before="100" w:beforeAutospacing="1" w:after="100" w:afterAutospacing="1" w:line="240" w:lineRule="auto"/>
+        <w:rPr>
+          <w:rFonts w:ascii="Times New Roman" w:eastAsia="Times New Roman" w:hAnsi="Times New Roman" w:cs="Times New Roman"/>
+          <w:sz w:val="24"/>
+          <w:szCs w:val="24"/>
+          <w:lang w:eastAsia="ru-RU"/>
+        </w:rPr>
+      </w:pPr>
+      <w:r>
+        <w:rPr>
+          <w:rFonts w:ascii="Times New Roman" w:eastAsia="Times New Roman" w:hAnsi="Times New Roman" w:cs="Times New Roman"/>
+          <w:sz w:val="24"/>
+          <w:szCs w:val="24"/>
+          <w:lang w:eastAsia="ru-RU"/>
+        </w:rPr>
+        <w:t>Переконайся, що Git бачить змінені файли (Modified / Added).</w:t>
+      </w:r>
+    </w:p>
+    <w:p>
+      <w:pPr>
+        <w:spacing w:after="0" w:line="240" w:lineRule="auto"/>
+        <w:rPr>
+          <w:rFonts w:ascii="Times New Roman" w:eastAsia="Times New Roman" w:hAnsi="Times New Roman" w:cs="Times New Roman"/>
+          <w:sz w:val="24"/>
+          <w:szCs w:val="24"/>
+          <w:lang w:eastAsia="ru-RU"/>
+        </w:rPr>
+      </w:pPr>
+      <w:r>
+        <w:rPr>
+          <w:rFonts w:ascii="Times New Roman" w:eastAsia="Times New Roman" w:hAnsi="Times New Roman" w:cs="Times New Roman"/>
+          <w:sz w:val="24"/>
+          <w:szCs w:val="24"/>
+          <w:lang w:eastAsia="ru-RU"/>
+        </w:rPr>
+        <w:pict w14:anchorId="7BF4605B">
+          <v:rect id="_x0000_i1037" style="width:0;height:1.5pt" o:hralign="center" o:hrstd="t" o:hr="t" fillcolor="#a0a0a0" stroked="f"/>
+        </w:pict>
+      </w:r>
+    </w:p>
+    <w:p>
+      <w:pPr>
+        <w:spacing w:before="100" w:beforeAutospacing="1" w:after="100" w:afterAutospacing="1" w:line="240" w:lineRule="auto"/>
+        <w:outlineLvl w:val="2"/>
+        <w:rPr>
+          <w:rFonts w:ascii="Times New Roman" w:eastAsia="Times New Roman" w:hAnsi="Times New Roman" w:cs="Times New Roman"/>
+          <w:b/>
+          <w:bCs/>
+          <w:sz w:val="27"/>
+          <w:szCs w:val="27"/>
+          <w:lang w:eastAsia="ru-RU"/>
+        </w:rPr>
+      </w:pPr>
+      <w:r>
+        <w:rPr>
+          <w:rFonts w:ascii="Segoe UI Emoji" w:eastAsia="Times New Roman" w:hAnsi="Segoe UI Emoji" w:cs="Segoe UI Emoji"/>
+          <w:b/>
+          <w:bCs/>
+          <w:sz w:val="27"/>
+          <w:szCs w:val="27"/>
+          <w:lang w:eastAsia="ru-RU"/>
+        </w:rPr>
+        <w:t>✅</w:t>
+      </w:r>
+      <w:r>
+        <w:rPr>
+          <w:rFonts w:ascii="Times New Roman" w:eastAsia="Times New Roman" w:hAnsi="Times New Roman" w:cs="Times New Roman"/>
+          <w:b/>
+          <w:bCs/>
+          <w:sz w:val="27"/>
+          <w:szCs w:val="27"/>
+          <w:lang w:eastAsia="ru-RU"/>
+        </w:rPr>
+        <w:t xml:space="preserve"> 2. Додаєш файли до коміту</w:t>
+      </w:r>
+    </w:p>
+    <w:p>
+      <w:pPr>
+        <w:tabs>
+          <w:tab w:val="left" w:pos="916"/>
+          <w:tab w:val="left" w:pos="1832"/>
+          <w:tab w:val="left" w:pos="2748"/>
+          <w:tab w:val="left" w:pos="3664"/>
+          <w:tab w:val="left" w:pos="4580"/>
+          <w:tab w:val="left" w:pos="5496"/>
+          <w:tab w:val="left" w:pos="6412"/>
+          <w:tab w:val="left" w:pos="7328"/>
+          <w:tab w:val="left" w:pos="8244"/>
+          <w:tab w:val="left" w:pos="9160"/>
+          <w:tab w:val="left" w:pos="10076"/>
+          <w:tab w:val="left" w:pos="10992"/>
+          <w:tab w:val="left" w:pos="11908"/>
+          <w:tab w:val="left" w:pos="12824"/>
+          <w:tab w:val="left" w:pos="13740"/>
+          <w:tab w:val="left" w:pos="14656"/>
+        </w:tabs>
+        <w:spacing w:after="0" w:line="240" w:lineRule="auto"/>
+        <w:rPr>
+          <w:rFonts w:ascii="Courier New" w:eastAsia="Times New Roman" w:hAnsi="Courier New" w:cs="Courier New"/>
+          <w:sz w:val="20"/>
+          <w:szCs w:val="20"/>
+          <w:lang w:eastAsia="ru-RU"/>
+        </w:rPr>
+      </w:pPr>
+      <w:r>
+        <w:rPr>
+          <w:rFonts w:ascii="Courier New" w:eastAsia="Times New Roman" w:hAnsi="Courier New" w:cs="Courier New"/>
+          <w:sz w:val="20"/>
+          <w:szCs w:val="20"/>
+          <w:lang w:eastAsia="ru-RU"/>
+        </w:rPr>
+        <w:t>git add .</w:t>
+      </w:r>
+    </w:p>
+    <w:p>
+      <w:pPr>
+        <w:spacing w:after="0" w:line="240" w:lineRule="auto"/>
+        <w:rPr>
+          <w:rFonts w:ascii="Times New Roman" w:eastAsia="Times New Roman" w:hAnsi="Times New Roman" w:cs="Times New Roman"/>
+          <w:sz w:val="24"/>
+          <w:szCs w:val="24"/>
+          <w:lang w:eastAsia="ru-RU"/>
+        </w:rPr>
+      </w:pPr>
+      <w:r>
+        <w:rPr>
+          <w:rFonts w:ascii="Times New Roman" w:eastAsia="Times New Roman" w:hAnsi="Times New Roman" w:cs="Times New Roman"/>
+          <w:sz w:val="24"/>
+          <w:szCs w:val="24"/>
+          <w:lang w:eastAsia="ru-RU"/>
+        </w:rPr>
+        <w:pict w14:anchorId="6921904C">
+          <v:rect id="_x0000_i1038" style="width:0;height:1.5pt" o:hralign="center" o:hrstd="t" o:hr="t" fillcolor="#a0a0a0" stroked="f"/>
+        </w:pict>
+      </w:r>
+    </w:p>
+    <w:p>
+      <w:pPr>
+        <w:spacing w:before="100" w:beforeAutospacing="1" w:after="100" w:afterAutospacing="1" w:line="240" w:lineRule="auto"/>
+        <w:outlineLvl w:val="2"/>
+        <w:rPr>
+          <w:rFonts w:ascii="Times New Roman" w:eastAsia="Times New Roman" w:hAnsi="Times New Roman" w:cs="Times New Roman"/>
+          <w:b/>
+          <w:bCs/>
+          <w:sz w:val="27"/>
+          <w:szCs w:val="27"/>
+          <w:lang w:eastAsia="ru-RU"/>
+        </w:rPr>
+      </w:pPr>
+      <w:r>
+        <w:rPr>
+          <w:rFonts w:ascii="Segoe UI Emoji" w:eastAsia="Times New Roman" w:hAnsi="Segoe UI Emoji" w:cs="Segoe UI Emoji"/>
+          <w:b/>
+          <w:bCs/>
+          <w:sz w:val="27"/>
+          <w:szCs w:val="27"/>
+          <w:lang w:eastAsia="ru-RU"/>
+        </w:rPr>
+        <w:t>✅</w:t>
+      </w:r>
+      <w:r>
+        <w:rPr>
+          <w:rFonts w:ascii="Times New Roman" w:eastAsia="Times New Roman" w:hAnsi="Times New Roman" w:cs="Times New Roman"/>
+          <w:b/>
+          <w:bCs/>
+          <w:sz w:val="27"/>
+          <w:szCs w:val="27"/>
+          <w:lang w:eastAsia="ru-RU"/>
+        </w:rPr>
+        <w:t xml:space="preserve"> 3. Створюєш коміт</w:t>
+      </w:r>
+    </w:p>
+    <w:p>
+      <w:pPr>
+        <w:tabs>
+          <w:tab w:val="left" w:pos="916"/>
+          <w:tab w:val="left" w:pos="1832"/>
+          <w:tab w:val="left" w:pos="2748"/>
+          <w:tab w:val="left" w:pos="3664"/>
+          <w:tab w:val="left" w:pos="4580"/>
+          <w:tab w:val="left" w:pos="5496"/>
+          <w:tab w:val="left" w:pos="6412"/>
+          <w:tab w:val="left" w:pos="7328"/>
+          <w:tab w:val="left" w:pos="8244"/>
+          <w:tab w:val="left" w:pos="9160"/>
+          <w:tab w:val="left" w:pos="10076"/>
+          <w:tab w:val="left" w:pos="10992"/>
+          <w:tab w:val="left" w:pos="11908"/>
+          <w:tab w:val="left" w:pos="12824"/>
+          <w:tab w:val="left" w:pos="13740"/>
+          <w:tab w:val="left" w:pos="14656"/>
+        </w:tabs>
+        <w:spacing w:after="0" w:line="240" w:lineRule="auto"/>
+        <w:rPr>
+          <w:rFonts w:ascii="Courier New" w:eastAsia="Times New Roman" w:hAnsi="Courier New" w:cs="Courier New"/>
+          <w:sz w:val="20"/>
+          <w:szCs w:val="20"/>
+          <w:lang w:eastAsia="ru-RU"/>
+        </w:rPr>
+      </w:pPr>
+      <w:r>
+        <w:rPr>
+          <w:rFonts w:ascii="Courier New" w:eastAsia="Times New Roman" w:hAnsi="Courier New" w:cs="Courier New"/>
+          <w:sz w:val="20"/>
+          <w:szCs w:val="20"/>
+          <w:lang w:eastAsia="ru-RU"/>
+        </w:rPr>
+        <w:t xml:space="preserve">git commit -m "update: new PWA files" </w:t>
+      </w:r>
+    </w:p>
+    <w:p>
+      <w:pPr>
+        <w:spacing w:before="100" w:beforeAutospacing="1" w:after="100" w:afterAutospacing="1" w:line="240" w:lineRule="auto"/>
+        <w:rPr>
+          <w:rFonts w:ascii="Times New Roman" w:eastAsia="Times New Roman" w:hAnsi="Times New Roman" w:cs="Times New Roman"/>
+          <w:sz w:val="24"/>
+          <w:szCs w:val="24"/>
+          <w:lang w:eastAsia="ru-RU"/>
+        </w:rPr>
+      </w:pPr>
+      <w:r>
+        <w:rPr>
+          <w:rFonts w:ascii="Times New Roman" w:eastAsia="Times New Roman" w:hAnsi="Times New Roman" w:cs="Times New Roman"/>
+          <w:i/>
+          <w:iCs/>
+          <w:sz w:val="24"/>
+          <w:szCs w:val="24"/>
+          <w:lang w:eastAsia="ru-RU"/>
+        </w:rPr>
+        <w:t>(тут можеш написати будь-який коментар)</w:t>
+      </w:r>
+    </w:p>
+    <w:p>
+      <w:pPr>
+        <w:spacing w:after="0" w:line="240" w:lineRule="auto"/>
+        <w:rPr>
+          <w:rFonts w:ascii="Times New Roman" w:eastAsia="Times New Roman" w:hAnsi="Times New Roman" w:cs="Times New Roman"/>
+          <w:sz w:val="24"/>
+          <w:szCs w:val="24"/>
+          <w:lang w:eastAsia="ru-RU"/>
+        </w:rPr>
+      </w:pPr>
+      <w:r>
+        <w:rPr>
+          <w:rFonts w:ascii="Times New Roman" w:eastAsia="Times New Roman" w:hAnsi="Times New Roman" w:cs="Times New Roman"/>
+          <w:sz w:val="24"/>
+          <w:szCs w:val="24"/>
+          <w:lang w:eastAsia="ru-RU"/>
+        </w:rPr>
+        <w:pict w14:anchorId="47A99C95">
+          <v:rect id="_x0000_i1039" style="width:0;height:1.5pt" o:hralign="center" o:hrstd="t" o:hr="t" fillcolor="#a0a0a0" stroked="f"/>
+        </w:pict>
+      </w:r>
+    </w:p>
+    <w:p>
+      <w:pPr>
+        <w:spacing w:before="100" w:beforeAutospacing="1" w:after="100" w:afterAutospacing="1" w:line="240" w:lineRule="auto"/>
+        <w:outlineLvl w:val="2"/>
+        <w:rPr>
+          <w:rFonts w:ascii="Times New Roman" w:eastAsia="Times New Roman" w:hAnsi="Times New Roman" w:cs="Times New Roman"/>
+          <w:b/>
+          <w:bCs/>
+          <w:sz w:val="27"/>
+          <w:szCs w:val="27"/>
+          <w:lang w:eastAsia="ru-RU"/>
+        </w:rPr>
+      </w:pPr>
+      <w:r>
+        <w:rPr>
+          <w:rFonts w:ascii="Segoe UI Emoji" w:eastAsia="Times New Roman" w:hAnsi="Segoe UI Emoji" w:cs="Segoe UI Emoji"/>
+          <w:b/>
+          <w:bCs/>
+          <w:sz w:val="27"/>
+          <w:szCs w:val="27"/>
+          <w:lang w:eastAsia="ru-RU"/>
+        </w:rPr>
+        <w:t>✅</w:t>
+      </w:r>
+      <w:r>
+        <w:rPr>
+          <w:rFonts w:ascii="Times New Roman" w:eastAsia="Times New Roman" w:hAnsi="Times New Roman" w:cs="Times New Roman"/>
+          <w:b/>
+          <w:bCs/>
+          <w:sz w:val="27"/>
+          <w:szCs w:val="27"/>
+          <w:lang w:eastAsia="ru-RU"/>
+        </w:rPr>
+        <w:t xml:space="preserve"> 4. Відправляєш зміни на GitHub</w:t>
+      </w:r>
+    </w:p>
+    <w:p>
+      <w:pPr>
+        <w:tabs>
+          <w:tab w:val="left" w:pos="916"/>
+          <w:tab w:val="left" w:pos="1832"/>
+          <w:tab w:val="left" w:pos="2748"/>
+          <w:tab w:val="left" w:pos="3664"/>
+          <w:tab w:val="left" w:pos="4580"/>
+          <w:tab w:val="left" w:pos="5496"/>
+          <w:tab w:val="left" w:pos="6412"/>
+          <w:tab w:val="left" w:pos="7328"/>
+          <w:tab w:val="left" w:pos="8244"/>
+          <w:tab w:val="left" w:pos="9160"/>
+          <w:tab w:val="left" w:pos="10076"/>
+          <w:tab w:val="left" w:pos="10992"/>
+          <w:tab w:val="left" w:pos="11908"/>
+          <w:tab w:val="left" w:pos="12824"/>
+          <w:tab w:val="left" w:pos="13740"/>
+          <w:tab w:val="left" w:pos="14656"/>
+        </w:tabs>
+        <w:spacing w:after="0" w:line="240" w:lineRule="auto"/>
+        <w:rPr>
+          <w:rFonts w:ascii="Courier New" w:eastAsia="Times New Roman" w:hAnsi="Courier New" w:cs="Courier New"/>
+          <w:sz w:val="20"/>
+          <w:szCs w:val="20"/>
+          <w:lang w:eastAsia="ru-RU"/>
+        </w:rPr>
+      </w:pPr>
+      <w:r>
+        <w:rPr>
+          <w:rFonts w:ascii="Courier New" w:eastAsia="Times New Roman" w:hAnsi="Courier New" w:cs="Courier New"/>
+          <w:sz w:val="20"/>
+          <w:szCs w:val="20"/>
+          <w:lang w:eastAsia="ru-RU"/>
+        </w:rPr>
+        <w:t>git push</w:t>
+      </w:r>
+    </w:p>
+    <w:p>
+      <w:pPr>
+        <w:spacing w:before="100" w:beforeAutospacing="1" w:after="100" w:afterAutospacing="1" w:line="240" w:lineRule="auto"/>
+        <w:rPr>
+          <w:rFonts w:ascii="Times New Roman" w:eastAsia="Times New Roman" w:hAnsi="Times New Roman" w:cs="Times New Roman"/>
+          <w:sz w:val="24"/>
+          <w:szCs w:val="24"/>
+          <w:lang w:eastAsia="ru-RU"/>
+        </w:rPr>
+      </w:pPr>
+      <w:r>
+        <w:rPr>
+          <w:rFonts w:ascii="Times New Roman" w:eastAsia="Times New Roman" w:hAnsi="Times New Roman" w:cs="Times New Roman"/>
+          <w:sz w:val="24"/>
+          <w:szCs w:val="24"/>
+          <w:lang w:eastAsia="ru-RU"/>
+        </w:rPr>
+        <w:t>Після цього:</w:t>
+      </w:r>
+    </w:p>
+    <w:p>
+      <w:pPr>
+        <w:numPr>
+          <w:ilvl w:val="0"/>
+          <w:numId w:val="8"/>
+        </w:numPr>
+        <w:spacing w:before="100" w:beforeAutospacing="1" w:after="100" w:afterAutospacing="1" w:line="240" w:lineRule="auto"/>
+        <w:rPr>
+          <w:rFonts w:ascii="Times New Roman" w:eastAsia="Times New Roman" w:hAnsi="Times New Roman" w:cs="Times New Roman"/>
+          <w:sz w:val="24"/>
+          <w:szCs w:val="24"/>
+          <w:lang w:eastAsia="ru-RU"/>
+        </w:rPr>
+      </w:pPr>
+      <w:r>
+        <w:rPr>
+          <w:rFonts w:ascii="Times New Roman" w:eastAsia="Times New Roman" w:hAnsi="Times New Roman" w:cs="Times New Roman"/>
+          <w:sz w:val="24"/>
+          <w:szCs w:val="24"/>
+          <w:lang w:eastAsia="ru-RU"/>
+        </w:rPr>
+        <w:t>GitHub оновлюється</w:t>
+      </w:r>
+    </w:p>
+    <w:p>
+      <w:pPr>
+        <w:numPr>
+          <w:ilvl w:val="0"/>
+          <w:numId w:val="8"/>
+        </w:numPr>
+        <w:spacing w:before="100" w:beforeAutospacing="1" w:after="100" w:afterAutospacing="1" w:line="240" w:lineRule="auto"/>
+        <w:rPr>
+          <w:rFonts w:ascii="Times New Roman" w:eastAsia="Times New Roman" w:hAnsi="Times New Roman" w:cs="Times New Roman"/>
+          <w:sz w:val="24"/>
+          <w:szCs w:val="24"/>
+          <w:lang w:eastAsia="ru-RU"/>
+        </w:rPr>
+      </w:pPr>
+      <w:r>
+        <w:rPr>
+          <w:rFonts w:ascii="Times New Roman" w:eastAsia="Times New Roman" w:hAnsi="Times New Roman" w:cs="Times New Roman"/>
+          <w:b/>
+          <w:bCs/>
+          <w:sz w:val="24"/>
+          <w:szCs w:val="24"/>
+          <w:lang w:eastAsia="ru-RU"/>
+        </w:rPr>
+        <w:t>Vercel автоматично запускає новий деплой</w:t>
+      </w:r>
+      <w:r>
+        <w:rPr>
+          <w:rFonts w:ascii="Times New Roman" w:eastAsia="Times New Roman" w:hAnsi="Times New Roman" w:cs="Times New Roman"/>
+          <w:sz w:val="24"/>
+          <w:szCs w:val="24"/>
+          <w:lang w:eastAsia="ru-RU"/>
+        </w:rPr>
+        <w:t>, бо він прив’язаний до твого GitHub репозиторію</w:t>
+      </w:r>
+    </w:p>
+    <w:p>
+      <w:pPr>
+        <w:spacing w:after="0" w:line="240" w:lineRule="auto"/>
+        <w:rPr>
+          <w:rFonts w:ascii="Times New Roman" w:eastAsia="Times New Roman" w:hAnsi="Times New Roman" w:cs="Times New Roman"/>
+          <w:sz w:val="24"/>
+          <w:szCs w:val="24"/>
+          <w:lang w:eastAsia="ru-RU"/>
+        </w:rPr>
+      </w:pPr>
+      <w:r>
+        <w:rPr>
+          <w:rFonts w:ascii="Times New Roman" w:eastAsia="Times New Roman" w:hAnsi="Times New Roman" w:cs="Times New Roman"/>
+          <w:sz w:val="24"/>
+          <w:szCs w:val="24"/>
+          <w:lang w:eastAsia="ru-RU"/>
+        </w:rPr>
+        <w:pict w14:anchorId="50E8EC53">
+          <v:rect id="_x0000_i1040" style="width:0;height:1.5pt" o:hralign="center" o:hrstd="t" o:hr="t" fillcolor="#a0a0a0" stroked="f"/>
+        </w:pict>
+      </w:r>
+    </w:p>
+    <w:p>
+      <w:pPr>
+        <w:spacing w:before="100" w:beforeAutospacing="1" w:after="100" w:afterAutospacing="1" w:line="240" w:lineRule="auto"/>
+        <w:outlineLvl w:val="2"/>
+        <w:rPr>
+          <w:rFonts w:ascii="Times New Roman" w:eastAsia="Times New Roman" w:hAnsi="Times New Roman" w:cs="Times New Roman"/>
+          <w:b/>
+          <w:bCs/>
+          <w:sz w:val="27"/>
+          <w:szCs w:val="27"/>
+          <w:lang w:eastAsia="ru-RU"/>
+        </w:rPr>
+      </w:pPr>
+      <w:r>
+        <w:rPr>
+          <w:rFonts w:ascii="Segoe UI Emoji" w:eastAsia="Times New Roman" w:hAnsi="Segoe UI Emoji" w:cs="Segoe UI Emoji"/>
+          <w:b/>
+          <w:bCs/>
+          <w:sz w:val="27"/>
+          <w:szCs w:val="27"/>
+          <w:lang w:eastAsia="ru-RU"/>
+        </w:rPr>
+        <w:t>✅</w:t>
+      </w:r>
+      <w:r>
+        <w:rPr>
+          <w:rFonts w:ascii="Times New Roman" w:eastAsia="Times New Roman" w:hAnsi="Times New Roman" w:cs="Times New Roman"/>
+          <w:b/>
+          <w:bCs/>
+          <w:sz w:val="27"/>
+          <w:szCs w:val="27"/>
+          <w:lang w:eastAsia="ru-RU"/>
+        </w:rPr>
+        <w:t xml:space="preserve"> 5. Перевіряєш деплой у Vercel</w:t>
+      </w:r>
+    </w:p>
+    <w:p>
+      <w:pPr>
+        <w:spacing w:before="100" w:beforeAutospacing="1" w:after="100" w:afterAutospacing="1" w:line="240" w:lineRule="auto"/>
+        <w:rPr>
+          <w:rFonts w:ascii="Times New Roman" w:eastAsia="Times New Roman" w:hAnsi="Times New Roman" w:cs="Times New Roman"/>
+          <w:sz w:val="24"/>
+          <w:szCs w:val="24"/>
+          <w:lang w:eastAsia="ru-RU"/>
+        </w:rPr>
+      </w:pPr>
+      <w:r>
+        <w:rPr>
+          <w:rFonts w:ascii="Times New Roman" w:eastAsia="Times New Roman" w:hAnsi="Times New Roman" w:cs="Times New Roman"/>
+          <w:sz w:val="24"/>
+          <w:szCs w:val="24"/>
+          <w:lang w:eastAsia="ru-RU"/>
+        </w:rPr>
+        <w:t>Іди у:</w:t>
+      </w:r>
+      <w:r>
+        <w:rPr>
+          <w:rFonts w:ascii="Times New Roman" w:eastAsia="Times New Roman" w:hAnsi="Times New Roman" w:cs="Times New Roman"/>
+          <w:sz w:val="24"/>
+          <w:szCs w:val="24"/>
+          <w:lang w:eastAsia="ru-RU"/>
+        </w:rPr>
+        <w:br/>
+      </w:r>
+      <w:r>
+        <w:rPr>
+          <w:rFonts w:ascii="Times New Roman" w:eastAsia="Times New Roman" w:hAnsi="Times New Roman" w:cs="Times New Roman"/>
+          <w:b/>
+          <w:bCs/>
+          <w:sz w:val="24"/>
+          <w:szCs w:val="24"/>
+          <w:lang w:eastAsia="ru-RU"/>
+        </w:rPr>
+        <w:t>Vercel → Dashboard → твій проєкт → Deployments</w:t>
+      </w:r>
+    </w:p>
+    <w:p>
+      <w:pPr>
+        <w:spacing w:before="100" w:beforeAutospacing="1" w:after="100" w:afterAutospacing="1" w:line="240" w:lineRule="auto"/>
+        <w:rPr>
+          <w:rFonts w:ascii="Times New Roman" w:eastAsia="Times New Roman" w:hAnsi="Times New Roman" w:cs="Times New Roman"/>
+          <w:sz w:val="24"/>
+          <w:szCs w:val="24"/>
+          <w:lang w:eastAsia="ru-RU"/>
+        </w:rPr>
+      </w:pPr>
+      <w:r>
+        <w:rPr>
+          <w:rFonts w:ascii="Times New Roman" w:eastAsia="Times New Roman" w:hAnsi="Times New Roman" w:cs="Times New Roman"/>
+          <w:sz w:val="24"/>
+          <w:szCs w:val="24"/>
+          <w:lang w:eastAsia="ru-RU"/>
+        </w:rPr>
+        <w:t>Там побачиш новий деплой зі статусом:</w:t>
+      </w:r>
+    </w:p>
+    <w:p>
+      <w:pPr>
+        <w:numPr>
+          <w:ilvl w:val="0"/>
+          <w:numId w:val="9"/>
+        </w:numPr>
+        <w:spacing w:before="100" w:beforeAutospacing="1" w:after="100" w:afterAutospacing="1" w:line="240" w:lineRule="auto"/>
+        <w:rPr>
+          <w:rFonts w:ascii="Times New Roman" w:eastAsia="Times New Roman" w:hAnsi="Times New Roman" w:cs="Times New Roman"/>
+          <w:sz w:val="24"/>
+          <w:szCs w:val="24"/>
+          <w:lang w:eastAsia="ru-RU"/>
+        </w:rPr>
+      </w:pPr>
+      <w:r>
+        <w:rPr>
+          <w:rFonts w:ascii="Times New Roman" w:eastAsia="Times New Roman" w:hAnsi="Times New Roman" w:cs="Times New Roman"/>
+          <w:i/>
+          <w:iCs/>
+          <w:sz w:val="24"/>
+          <w:szCs w:val="24"/>
+          <w:lang w:eastAsia="ru-RU"/>
+        </w:rPr>
+        <w:t>Building…</w:t>
+      </w:r>
+    </w:p>
+    <w:p>
+      <w:pPr>
+        <w:numPr>
+          <w:ilvl w:val="0"/>
+          <w:numId w:val="9"/>
+        </w:numPr>
+        <w:spacing w:before="100" w:beforeAutospacing="1" w:after="100" w:afterAutospacing="1" w:line="240" w:lineRule="auto"/>
+        <w:rPr>
+          <w:rFonts w:ascii="Times New Roman" w:eastAsia="Times New Roman" w:hAnsi="Times New Roman" w:cs="Times New Roman"/>
+          <w:sz w:val="24"/>
+          <w:szCs w:val="24"/>
+          <w:lang w:eastAsia="ru-RU"/>
+        </w:rPr>
+      </w:pPr>
+      <w:r>
+        <w:rPr>
+          <w:rFonts w:ascii="Times New Roman" w:eastAsia="Times New Roman" w:hAnsi="Times New Roman" w:cs="Times New Roman"/>
+          <w:sz w:val="24"/>
+          <w:szCs w:val="24"/>
+          <w:lang w:eastAsia="ru-RU"/>
+        </w:rPr>
+        <w:t xml:space="preserve">потім </w:t>
+      </w:r>
+      <w:r>
+        <w:rPr>
+          <w:rFonts w:ascii="Times New Roman" w:eastAsia="Times New Roman" w:hAnsi="Times New Roman" w:cs="Times New Roman"/>
+          <w:i/>
+          <w:iCs/>
+          <w:sz w:val="24"/>
+          <w:szCs w:val="24"/>
+          <w:lang w:eastAsia="ru-RU"/>
+        </w:rPr>
+        <w:t>Ready</w:t>
+      </w:r>
+    </w:p>
+    <w:p>
+      <w:pPr>
+        <w:spacing w:before="100" w:beforeAutospacing="1" w:after="100" w:afterAutospacing="1" w:line="240" w:lineRule="auto"/>
+        <w:rPr>
+          <w:rFonts w:ascii="Times New Roman" w:eastAsia="Times New Roman" w:hAnsi="Times New Roman" w:cs="Times New Roman"/>
+          <w:sz w:val="24"/>
+          <w:szCs w:val="24"/>
+          <w:lang w:eastAsia="ru-RU"/>
+        </w:rPr>
+      </w:pPr>
+      <w:r>
+        <w:rPr>
+          <w:rFonts w:ascii="Times New Roman" w:eastAsia="Times New Roman" w:hAnsi="Times New Roman" w:cs="Times New Roman"/>
+          <w:sz w:val="24"/>
+          <w:szCs w:val="24"/>
+          <w:lang w:eastAsia="ru-RU"/>
+        </w:rPr>
+        <w:t>Якщо є помилки — вони будуть у логах цього деплоя.</w:t>
+      </w:r>
+    </w:p>
+    <w:p>
+      <w:pPr>
+        <w:spacing w:after="0" w:line="240" w:lineRule="auto"/>
+        <w:rPr>
+          <w:rFonts w:ascii="Times New Roman" w:eastAsia="Times New Roman" w:hAnsi="Times New Roman" w:cs="Times New Roman"/>
+          <w:sz w:val="24"/>
+          <w:szCs w:val="24"/>
+          <w:lang w:eastAsia="ru-RU"/>
+        </w:rPr>
+      </w:pPr>
+      <w:r>
+        <w:rPr>
+          <w:rFonts w:ascii="Times New Roman" w:eastAsia="Times New Roman" w:hAnsi="Times New Roman" w:cs="Times New Roman"/>
+          <w:sz w:val="24"/>
+          <w:szCs w:val="24"/>
+          <w:lang w:eastAsia="ru-RU"/>
+        </w:rPr>
+        <w:pict w14:anchorId="12BF1115">
+          <v:rect id="_x0000_i1041" style="width:0;height:1.5pt" o:hralign="center" o:hrstd="t" o:hr="t" fillcolor="#a0a0a0" stroked="f"/>
+        </w:pict>
+      </w:r>
+    </w:p>
+    <w:p>
+      <w:pPr>
+        <w:spacing w:before="100" w:beforeAutospacing="1" w:after="100" w:afterAutospacing="1" w:line="240" w:lineRule="auto"/>
+        <w:rPr>
+          <w:rFonts w:ascii="Times New Roman" w:eastAsia="Times New Roman" w:hAnsi="Times New Roman" w:cs="Times New Roman"/>
+          <w:sz w:val="24"/>
+          <w:szCs w:val="24"/>
+          <w:lang w:eastAsia="ru-RU"/>
+        </w:rPr>
+      </w:pPr>
+      <w:r>
+        <w:rPr>
+          <w:rFonts w:ascii="Times New Roman" w:eastAsia="Times New Roman" w:hAnsi="Times New Roman" w:cs="Times New Roman"/>
+          <w:sz w:val="24"/>
+          <w:szCs w:val="24"/>
+          <w:lang w:eastAsia="ru-RU"/>
+        </w:rPr>
+        <w:t xml:space="preserve">Після </w:t>
+      </w:r>
+      <w:r>
+        <w:rPr>
+          <w:rFonts w:ascii="Courier New" w:eastAsia="Times New Roman" w:hAnsi="Courier New" w:cs="Courier New"/>
+          <w:sz w:val="20"/>
+          <w:szCs w:val="20"/>
+          <w:lang w:eastAsia="ru-RU"/>
+        </w:rPr>
+        <w:t>git push</w:t>
+      </w:r>
+      <w:r>
+        <w:rPr>
+          <w:rFonts w:ascii="Times New Roman" w:eastAsia="Times New Roman" w:hAnsi="Times New Roman" w:cs="Times New Roman"/>
+          <w:sz w:val="24"/>
+          <w:szCs w:val="24"/>
+          <w:lang w:eastAsia="ru-RU"/>
+        </w:rPr>
+        <w:t xml:space="preserve"> тобі взагалі </w:t>
+      </w:r>
+      <w:r>
+        <w:rPr>
+          <w:rFonts w:ascii="Times New Roman" w:eastAsia="Times New Roman" w:hAnsi="Times New Roman" w:cs="Times New Roman"/>
+          <w:b/>
+          <w:bCs/>
+          <w:sz w:val="24"/>
+          <w:szCs w:val="24"/>
+          <w:lang w:eastAsia="ru-RU"/>
+        </w:rPr>
+        <w:t>нічого додаткового робити не треба</w:t>
+      </w:r>
+      <w:r>
+        <w:rPr>
+          <w:rFonts w:ascii="Times New Roman" w:eastAsia="Times New Roman" w:hAnsi="Times New Roman" w:cs="Times New Roman"/>
+          <w:sz w:val="24"/>
+          <w:szCs w:val="24"/>
+          <w:lang w:eastAsia="ru-RU"/>
+        </w:rPr>
+        <w:t xml:space="preserve"> — Vercel усе робить автоматично.</w:t>
+      </w:r>
+    </w:p>
+    <w:p>
+      <w:pPr>
+        <w:spacing w:after="0" w:line="240" w:lineRule="auto"/>
+        <w:rPr>
+          <w:rFonts w:ascii="Times New Roman" w:eastAsia="Times New Roman" w:hAnsi="Times New Roman" w:cs="Times New Roman"/>
+          <w:sz w:val="24"/>
+          <w:szCs w:val="24"/>
+          <w:lang w:eastAsia="ru-RU"/>
+        </w:rPr>
+      </w:pPr>
+      <w:r>
+        <w:rPr>
+          <w:rFonts w:ascii="Times New Roman" w:eastAsia="Times New Roman" w:hAnsi="Times New Roman" w:cs="Times New Roman"/>
+          <w:sz w:val="24"/>
+          <w:szCs w:val="24"/>
+          <w:lang w:eastAsia="ru-RU"/>
+        </w:rPr>
+        <w:pict w14:anchorId="46FF1FCE">
+          <v:rect id="_x0000_i1042" style="width:0;height:1.5pt" o:hralign="center" o:hrstd="t" o:hr="t" fillcolor="#a0a0a0" stroked="f"/>
+        </w:pict>
+      </w:r>
+    </w:p>
+    <w:p>
+      <w:pPr>
+        <w:spacing w:before="100" w:beforeAutospacing="1" w:after="100" w:afterAutospacing="1" w:line="240" w:lineRule="auto"/>
+        <w:rPr>
+          <w:rFonts w:ascii="Times New Roman" w:eastAsia="Times New Roman" w:hAnsi="Times New Roman" w:cs="Times New Roman"/>
+          <w:sz w:val="24"/>
+          <w:szCs w:val="24"/>
+          <w:lang w:eastAsia="ru-RU"/>
+        </w:rPr>
+      </w:pPr>
     </w:p>
     <w:p>
       <w:pPr>
@@ -1477,7 +2330,6 @@
           <w:szCs w:val="36"/>
           <w:lang w:eastAsia="ru-RU"/>
         </w:rPr>
-        <w:lastRenderedPageBreak/>
         <w:t>📱</w:t>
       </w:r>
       <w:r>
@@ -1602,7 +2454,7 @@
           <w:lang w:eastAsia="ru-RU"/>
         </w:rPr>
         <w:pict w14:anchorId="4548AADE">
-          <v:rect id="_x0000_i1256" style="width:0;height:1.5pt" o:hralign="center" o:hrstd="t" o:hr="t" fillcolor="#a0a0a0" stroked="f"/>
+          <v:rect id="_x0000_i1029" style="width:0;height:1.5pt" o:hralign="center" o:hrstd="t" o:hr="t" fillcolor="#a0a0a0" stroked="f"/>
         </w:pict>
       </w:r>
     </w:p>
@@ -2072,7 +2924,7 @@
           <w:lang w:eastAsia="ru-RU"/>
         </w:rPr>
         <w:pict w14:anchorId="0FCFE62F">
-          <v:rect id="_x0000_i1257" style="width:0;height:1.5pt" o:hralign="center" o:hrstd="t" o:hr="t" fillcolor="#a0a0a0" stroked="f"/>
+          <v:rect id="_x0000_i1030" style="width:0;height:1.5pt" o:hralign="center" o:hrstd="t" o:hr="t" fillcolor="#a0a0a0" stroked="f"/>
         </w:pict>
       </w:r>
     </w:p>
@@ -2348,7 +3200,7 @@
           <w:lang w:eastAsia="ru-RU"/>
         </w:rPr>
         <w:pict w14:anchorId="35BE6341">
-          <v:rect id="_x0000_i1258" style="width:0;height:1.5pt" o:hralign="center" o:hrstd="t" o:hr="t" fillcolor="#a0a0a0" stroked="f"/>
+          <v:rect id="_x0000_i1031" style="width:0;height:1.5pt" o:hralign="center" o:hrstd="t" o:hr="t" fillcolor="#a0a0a0" stroked="f"/>
         </w:pict>
       </w:r>
     </w:p>
@@ -2526,7 +3378,7 @@
           <w:lang w:eastAsia="ru-RU"/>
         </w:rPr>
         <w:pict w14:anchorId="63F287B5">
-          <v:rect id="_x0000_i1259" style="width:0;height:1.5pt" o:hralign="center" o:hrstd="t" o:hr="t" fillcolor="#a0a0a0" stroked="f"/>
+          <v:rect id="_x0000_i1032" style="width:0;height:1.5pt" o:hralign="center" o:hrstd="t" o:hr="t" fillcolor="#a0a0a0" stroked="f"/>
         </w:pict>
       </w:r>
     </w:p>
@@ -2795,6 +3647,7 @@
           <w:szCs w:val="24"/>
           <w:lang w:eastAsia="ru-RU"/>
         </w:rPr>
+        <w:lastRenderedPageBreak/>
         <w:t xml:space="preserve">Натисни </w:t>
       </w:r>
       <w:r>
@@ -2853,9 +3706,8 @@
           <w:szCs w:val="24"/>
           <w:lang w:eastAsia="ru-RU"/>
         </w:rPr>
-        <w:lastRenderedPageBreak/>
         <w:pict w14:anchorId="6A4D1573">
-          <v:rect id="_x0000_i1260" style="width:0;height:1.5pt" o:hralign="center" o:hrstd="t" o:hr="t" fillcolor="#a0a0a0" stroked="f"/>
+          <v:rect id="_x0000_i1033" style="width:0;height:1.5pt" o:hralign="center" o:hrstd="t" o:hr="t" fillcolor="#a0a0a0" stroked="f"/>
         </w:pict>
       </w:r>
     </w:p>
@@ -3137,7 +3989,7 @@
           <w:lang w:eastAsia="ru-RU"/>
         </w:rPr>
         <w:pict w14:anchorId="2A3CCFCB">
-          <v:rect id="_x0000_i1261" style="width:0;height:1.5pt" o:hralign="center" o:hrstd="t" o:hr="t" fillcolor="#a0a0a0" stroked="f"/>
+          <v:rect id="_x0000_i1034" style="width:0;height:1.5pt" o:hralign="center" o:hrstd="t" o:hr="t" fillcolor="#a0a0a0" stroked="f"/>
         </w:pict>
       </w:r>
     </w:p>
@@ -3291,7 +4143,7 @@
           <w:lang w:eastAsia="ru-RU"/>
         </w:rPr>
         <w:pict w14:anchorId="79FC719D">
-          <v:rect id="_x0000_i1262" style="width:0;height:1.5pt" o:hralign="center" o:hrstd="t" o:hr="t" fillcolor="#a0a0a0" stroked="f"/>
+          <v:rect id="_x0000_i1035" style="width:0;height:1.5pt" o:hralign="center" o:hrstd="t" o:hr="t" fillcolor="#a0a0a0" stroked="f"/>
         </w:pict>
       </w:r>
     </w:p>
@@ -3754,7 +4606,7 @@
           <w:lang w:eastAsia="ru-RU"/>
         </w:rPr>
         <w:pict w14:anchorId="649F9030">
-          <v:rect id="_x0000_i1263" style="width:0;height:1.5pt" o:hralign="center" o:hrstd="t" o:hr="t" fillcolor="#a0a0a0" stroked="f"/>
+          <v:rect id="_x0000_i1036" style="width:0;height:1.5pt" o:hralign="center" o:hrstd="t" o:hr="t" fillcolor="#a0a0a0" stroked="f"/>
         </w:pict>
       </w:r>
     </w:p>
@@ -3888,6 +4740,155 @@
     </w:lvl>
   </w:abstractNum>
   <w:abstractNum w:abstractNumId="1" w15:restartNumberingAfterBreak="0">
+    <w:nsid w:val="154E1029"/>
+    <w:multiLevelType w:val="multilevel"/>
+    <w:tmpl w:val="404E6726"/>
+    <w:lvl w:ilvl="0">
+      <w:start w:val="1"/>
+      <w:numFmt w:val="bullet"/>
+      <w:lvlText w:val=""/>
+      <w:lvlJc w:val="left"/>
+      <w:pPr>
+        <w:tabs>
+          <w:tab w:val="num" w:pos="720"/>
+        </w:tabs>
+        <w:ind w:left="720" w:hanging="360"/>
+      </w:pPr>
+      <w:rPr>
+        <w:rFonts w:ascii="Symbol" w:hAnsi="Symbol" w:hint="default"/>
+        <w:sz w:val="20"/>
+      </w:rPr>
+    </w:lvl>
+    <w:lvl w:ilvl="1" w:tentative="1">
+      <w:start w:val="1"/>
+      <w:numFmt w:val="bullet"/>
+      <w:lvlText w:val="o"/>
+      <w:lvlJc w:val="left"/>
+      <w:pPr>
+        <w:tabs>
+          <w:tab w:val="num" w:pos="1440"/>
+        </w:tabs>
+        <w:ind w:left="1440" w:hanging="360"/>
+      </w:pPr>
+      <w:rPr>
+        <w:rFonts w:ascii="Courier New" w:hAnsi="Courier New" w:hint="default"/>
+        <w:sz w:val="20"/>
+      </w:rPr>
+    </w:lvl>
+    <w:lvl w:ilvl="2" w:tentative="1">
+      <w:start w:val="1"/>
+      <w:numFmt w:val="bullet"/>
+      <w:lvlText w:val=""/>
+      <w:lvlJc w:val="left"/>
+      <w:pPr>
+        <w:tabs>
+          <w:tab w:val="num" w:pos="2160"/>
+        </w:tabs>
+        <w:ind w:left="2160" w:hanging="360"/>
+      </w:pPr>
+      <w:rPr>
+        <w:rFonts w:ascii="Wingdings" w:hAnsi="Wingdings" w:hint="default"/>
+        <w:sz w:val="20"/>
+      </w:rPr>
+    </w:lvl>
+    <w:lvl w:ilvl="3" w:tentative="1">
+      <w:start w:val="1"/>
+      <w:numFmt w:val="bullet"/>
+      <w:lvlText w:val=""/>
+      <w:lvlJc w:val="left"/>
+      <w:pPr>
+        <w:tabs>
+          <w:tab w:val="num" w:pos="2880"/>
+        </w:tabs>
+        <w:ind w:left="2880" w:hanging="360"/>
+      </w:pPr>
+      <w:rPr>
+        <w:rFonts w:ascii="Wingdings" w:hAnsi="Wingdings" w:hint="default"/>
+        <w:sz w:val="20"/>
+      </w:rPr>
+    </w:lvl>
+    <w:lvl w:ilvl="4" w:tentative="1">
+      <w:start w:val="1"/>
+      <w:numFmt w:val="bullet"/>
+      <w:lvlText w:val=""/>
+      <w:lvlJc w:val="left"/>
+      <w:pPr>
+        <w:tabs>
+          <w:tab w:val="num" w:pos="3600"/>
+        </w:tabs>
+        <w:ind w:left="3600" w:hanging="360"/>
+      </w:pPr>
+      <w:rPr>
+        <w:rFonts w:ascii="Wingdings" w:hAnsi="Wingdings" w:hint="default"/>
+        <w:sz w:val="20"/>
+      </w:rPr>
+    </w:lvl>
+    <w:lvl w:ilvl="5" w:tentative="1">
+      <w:start w:val="1"/>
+      <w:numFmt w:val="bullet"/>
+      <w:lvlText w:val=""/>
+      <w:lvlJc w:val="left"/>
+      <w:pPr>
+        <w:tabs>
+          <w:tab w:val="num" w:pos="4320"/>
+        </w:tabs>
+        <w:ind w:left="4320" w:hanging="360"/>
+      </w:pPr>
+      <w:rPr>
+        <w:rFonts w:ascii="Wingdings" w:hAnsi="Wingdings" w:hint="default"/>
+        <w:sz w:val="20"/>
+      </w:rPr>
+    </w:lvl>
+    <w:lvl w:ilvl="6" w:tentative="1">
+      <w:start w:val="1"/>
+      <w:numFmt w:val="bullet"/>
+      <w:lvlText w:val=""/>
+      <w:lvlJc w:val="left"/>
+      <w:pPr>
+        <w:tabs>
+          <w:tab w:val="num" w:pos="5040"/>
+        </w:tabs>
+        <w:ind w:left="5040" w:hanging="360"/>
+      </w:pPr>
+      <w:rPr>
+        <w:rFonts w:ascii="Wingdings" w:hAnsi="Wingdings" w:hint="default"/>
+        <w:sz w:val="20"/>
+      </w:rPr>
+    </w:lvl>
+    <w:lvl w:ilvl="7" w:tentative="1">
+      <w:start w:val="1"/>
+      <w:numFmt w:val="bullet"/>
+      <w:lvlText w:val=""/>
+      <w:lvlJc w:val="left"/>
+      <w:pPr>
+        <w:tabs>
+          <w:tab w:val="num" w:pos="5760"/>
+        </w:tabs>
+        <w:ind w:left="5760" w:hanging="360"/>
+      </w:pPr>
+      <w:rPr>
+        <w:rFonts w:ascii="Wingdings" w:hAnsi="Wingdings" w:hint="default"/>
+        <w:sz w:val="20"/>
+      </w:rPr>
+    </w:lvl>
+    <w:lvl w:ilvl="8" w:tentative="1">
+      <w:start w:val="1"/>
+      <w:numFmt w:val="bullet"/>
+      <w:lvlText w:val=""/>
+      <w:lvlJc w:val="left"/>
+      <w:pPr>
+        <w:tabs>
+          <w:tab w:val="num" w:pos="6480"/>
+        </w:tabs>
+        <w:ind w:left="6480" w:hanging="360"/>
+      </w:pPr>
+      <w:rPr>
+        <w:rFonts w:ascii="Wingdings" w:hAnsi="Wingdings" w:hint="default"/>
+        <w:sz w:val="20"/>
+      </w:rPr>
+    </w:lvl>
+  </w:abstractNum>
+  <w:abstractNum w:abstractNumId="2" w15:restartNumberingAfterBreak="0">
     <w:nsid w:val="23DB477A"/>
     <w:multiLevelType w:val="multilevel"/>
     <w:tmpl w:val="95A093E8"/>
@@ -4004,7 +5005,7 @@
       </w:pPr>
     </w:lvl>
   </w:abstractNum>
-  <w:abstractNum w:abstractNumId="2" w15:restartNumberingAfterBreak="0">
+  <w:abstractNum w:abstractNumId="3" w15:restartNumberingAfterBreak="0">
     <w:nsid w:val="370F6953"/>
     <w:multiLevelType w:val="multilevel"/>
     <w:tmpl w:val="BAACE744"/>
@@ -4117,7 +5118,156 @@
       </w:pPr>
     </w:lvl>
   </w:abstractNum>
-  <w:abstractNum w:abstractNumId="3" w15:restartNumberingAfterBreak="0">
+  <w:abstractNum w:abstractNumId="4" w15:restartNumberingAfterBreak="0">
+    <w:nsid w:val="3BA74282"/>
+    <w:multiLevelType w:val="multilevel"/>
+    <w:tmpl w:val="81B0C104"/>
+    <w:lvl w:ilvl="0">
+      <w:start w:val="1"/>
+      <w:numFmt w:val="bullet"/>
+      <w:lvlText w:val=""/>
+      <w:lvlJc w:val="left"/>
+      <w:pPr>
+        <w:tabs>
+          <w:tab w:val="num" w:pos="720"/>
+        </w:tabs>
+        <w:ind w:left="720" w:hanging="360"/>
+      </w:pPr>
+      <w:rPr>
+        <w:rFonts w:ascii="Symbol" w:hAnsi="Symbol" w:hint="default"/>
+        <w:sz w:val="20"/>
+      </w:rPr>
+    </w:lvl>
+    <w:lvl w:ilvl="1" w:tentative="1">
+      <w:start w:val="1"/>
+      <w:numFmt w:val="bullet"/>
+      <w:lvlText w:val="o"/>
+      <w:lvlJc w:val="left"/>
+      <w:pPr>
+        <w:tabs>
+          <w:tab w:val="num" w:pos="1440"/>
+        </w:tabs>
+        <w:ind w:left="1440" w:hanging="360"/>
+      </w:pPr>
+      <w:rPr>
+        <w:rFonts w:ascii="Courier New" w:hAnsi="Courier New" w:hint="default"/>
+        <w:sz w:val="20"/>
+      </w:rPr>
+    </w:lvl>
+    <w:lvl w:ilvl="2" w:tentative="1">
+      <w:start w:val="1"/>
+      <w:numFmt w:val="bullet"/>
+      <w:lvlText w:val=""/>
+      <w:lvlJc w:val="left"/>
+      <w:pPr>
+        <w:tabs>
+          <w:tab w:val="num" w:pos="2160"/>
+        </w:tabs>
+        <w:ind w:left="2160" w:hanging="360"/>
+      </w:pPr>
+      <w:rPr>
+        <w:rFonts w:ascii="Wingdings" w:hAnsi="Wingdings" w:hint="default"/>
+        <w:sz w:val="20"/>
+      </w:rPr>
+    </w:lvl>
+    <w:lvl w:ilvl="3" w:tentative="1">
+      <w:start w:val="1"/>
+      <w:numFmt w:val="bullet"/>
+      <w:lvlText w:val=""/>
+      <w:lvlJc w:val="left"/>
+      <w:pPr>
+        <w:tabs>
+          <w:tab w:val="num" w:pos="2880"/>
+        </w:tabs>
+        <w:ind w:left="2880" w:hanging="360"/>
+      </w:pPr>
+      <w:rPr>
+        <w:rFonts w:ascii="Wingdings" w:hAnsi="Wingdings" w:hint="default"/>
+        <w:sz w:val="20"/>
+      </w:rPr>
+    </w:lvl>
+    <w:lvl w:ilvl="4" w:tentative="1">
+      <w:start w:val="1"/>
+      <w:numFmt w:val="bullet"/>
+      <w:lvlText w:val=""/>
+      <w:lvlJc w:val="left"/>
+      <w:pPr>
+        <w:tabs>
+          <w:tab w:val="num" w:pos="3600"/>
+        </w:tabs>
+        <w:ind w:left="3600" w:hanging="360"/>
+      </w:pPr>
+      <w:rPr>
+        <w:rFonts w:ascii="Wingdings" w:hAnsi="Wingdings" w:hint="default"/>
+        <w:sz w:val="20"/>
+      </w:rPr>
+    </w:lvl>
+    <w:lvl w:ilvl="5" w:tentative="1">
+      <w:start w:val="1"/>
+      <w:numFmt w:val="bullet"/>
+      <w:lvlText w:val=""/>
+      <w:lvlJc w:val="left"/>
+      <w:pPr>
+        <w:tabs>
+          <w:tab w:val="num" w:pos="4320"/>
+        </w:tabs>
+        <w:ind w:left="4320" w:hanging="360"/>
+      </w:pPr>
+      <w:rPr>
+        <w:rFonts w:ascii="Wingdings" w:hAnsi="Wingdings" w:hint="default"/>
+        <w:sz w:val="20"/>
+      </w:rPr>
+    </w:lvl>
+    <w:lvl w:ilvl="6" w:tentative="1">
+      <w:start w:val="1"/>
+      <w:numFmt w:val="bullet"/>
+      <w:lvlText w:val=""/>
+      <w:lvlJc w:val="left"/>
+      <w:pPr>
+        <w:tabs>
+          <w:tab w:val="num" w:pos="5040"/>
+        </w:tabs>
+        <w:ind w:left="5040" w:hanging="360"/>
+      </w:pPr>
+      <w:rPr>
+        <w:rFonts w:ascii="Wingdings" w:hAnsi="Wingdings" w:hint="default"/>
+        <w:sz w:val="20"/>
+      </w:rPr>
+    </w:lvl>
+    <w:lvl w:ilvl="7" w:tentative="1">
+      <w:start w:val="1"/>
+      <w:numFmt w:val="bullet"/>
+      <w:lvlText w:val=""/>
+      <w:lvlJc w:val="left"/>
+      <w:pPr>
+        <w:tabs>
+          <w:tab w:val="num" w:pos="5760"/>
+        </w:tabs>
+        <w:ind w:left="5760" w:hanging="360"/>
+      </w:pPr>
+      <w:rPr>
+        <w:rFonts w:ascii="Wingdings" w:hAnsi="Wingdings" w:hint="default"/>
+        <w:sz w:val="20"/>
+      </w:rPr>
+    </w:lvl>
+    <w:lvl w:ilvl="8" w:tentative="1">
+      <w:start w:val="1"/>
+      <w:numFmt w:val="bullet"/>
+      <w:lvlText w:val=""/>
+      <w:lvlJc w:val="left"/>
+      <w:pPr>
+        <w:tabs>
+          <w:tab w:val="num" w:pos="6480"/>
+        </w:tabs>
+        <w:ind w:left="6480" w:hanging="360"/>
+      </w:pPr>
+      <w:rPr>
+        <w:rFonts w:ascii="Wingdings" w:hAnsi="Wingdings" w:hint="default"/>
+        <w:sz w:val="20"/>
+      </w:rPr>
+    </w:lvl>
+  </w:abstractNum>
+  <w:abstractNum w:abstractNumId="5" w15:restartNumberingAfterBreak="0">
     <w:nsid w:val="4E0714FD"/>
     <w:multiLevelType w:val="multilevel"/>
     <w:tmpl w:val="A90CC5F2"/>
@@ -4230,7 +5380,7 @@
       </w:pPr>
     </w:lvl>
   </w:abstractNum>
-  <w:abstractNum w:abstractNumId="4" w15:restartNumberingAfterBreak="0">
+  <w:abstractNum w:abstractNumId="6" w15:restartNumberingAfterBreak="0">
     <w:nsid w:val="52D4450F"/>
     <w:multiLevelType w:val="multilevel"/>
     <w:tmpl w:val="0A12A470"/>
@@ -4347,7 +5497,7 @@
       </w:pPr>
     </w:lvl>
   </w:abstractNum>
-  <w:abstractNum w:abstractNumId="5" w15:restartNumberingAfterBreak="0">
+  <w:abstractNum w:abstractNumId="7" w15:restartNumberingAfterBreak="0">
     <w:nsid w:val="52DD2CC6"/>
     <w:multiLevelType w:val="multilevel"/>
     <w:tmpl w:val="E532442C"/>
@@ -4464,7 +5614,7 @@
       </w:pPr>
     </w:lvl>
   </w:abstractNum>
-  <w:abstractNum w:abstractNumId="6" w15:restartNumberingAfterBreak="0">
+  <w:abstractNum w:abstractNumId="8" w15:restartNumberingAfterBreak="0">
     <w:nsid w:val="61EE354D"/>
     <w:multiLevelType w:val="multilevel"/>
     <w:tmpl w:val="F29272AE"/>
@@ -4582,25 +5732,31 @@
     </w:lvl>
   </w:abstractNum>
   <w:num w:numId="1">
-    <w:abstractNumId w:val="2"/>
+    <w:abstractNumId w:val="3"/>
   </w:num>
   <w:num w:numId="2">
-    <w:abstractNumId w:val="4"/>
+    <w:abstractNumId w:val="6"/>
   </w:num>
   <w:num w:numId="3">
-    <w:abstractNumId w:val="6"/>
+    <w:abstractNumId w:val="8"/>
   </w:num>
   <w:num w:numId="4">
     <w:abstractNumId w:val="0"/>
   </w:num>
   <w:num w:numId="5">
-    <w:abstractNumId w:val="3"/>
+    <w:abstractNumId w:val="5"/>
   </w:num>
   <w:num w:numId="6">
-    <w:abstractNumId w:val="1"/>
+    <w:abstractNumId w:val="2"/>
   </w:num>
   <w:num w:numId="7">
-    <w:abstractNumId w:val="5"/>
+    <w:abstractNumId w:val="7"/>
+  </w:num>
+  <w:num w:numId="8">
+    <w:abstractNumId w:val="4"/>
+  </w:num>
+  <w:num w:numId="9">
+    <w:abstractNumId w:val="1"/>
   </w:num>
 </w:numbering>
 </file>
@@ -5204,6 +6360,17 @@
       <w:u w:val="single"/>
     </w:rPr>
   </w:style>
+  <w:style w:type="character" w:styleId="a6">
+    <w:name w:val="Emphasis"/>
+    <w:basedOn w:val="a0"/>
+    <w:uiPriority w:val="20"/>
+    <w:qFormat/>
+    <w:rsid w:val="009E2CBF"/>
+    <w:rPr>
+      <w:i/>
+      <w:iCs/>
+    </w:rPr>
+  </w:style>
 </w:styles>
 </file>
 

</xml_diff>

<commit_message>
Fix firestore folder, add hooks and update imports
</commit_message>
<xml_diff>
--- a/🧭 Дорожня карта.docx
+++ b/🧭 Дорожня карта.docx
@@ -1625,7 +1625,7 @@
           <w:lang w:eastAsia="ru-RU"/>
         </w:rPr>
         <w:pict w14:anchorId="7BF4605B">
-          <v:rect id="_x0000_i1037" style="width:0;height:1.5pt" o:hralign="center" o:hrstd="t" o:hr="t" fillcolor="#a0a0a0" stroked="f"/>
+          <v:rect id="_x0000_i1029" style="width:0;height:1.5pt" o:hralign="center" o:hrstd="t" o:hr="t" fillcolor="#a0a0a0" stroked="f"/>
         </w:pict>
       </w:r>
     </w:p>
@@ -1721,7 +1721,7 @@
           <w:lang w:eastAsia="ru-RU"/>
         </w:rPr>
         <w:pict w14:anchorId="6921904C">
-          <v:rect id="_x0000_i1038" style="width:0;height:1.5pt" o:hralign="center" o:hrstd="t" o:hr="t" fillcolor="#a0a0a0" stroked="f"/>
+          <v:rect id="_x0000_i1030" style="width:0;height:1.5pt" o:hralign="center" o:hrstd="t" o:hr="t" fillcolor="#a0a0a0" stroked="f"/>
         </w:pict>
       </w:r>
     </w:p>
@@ -1839,7 +1839,7 @@
           <w:lang w:eastAsia="ru-RU"/>
         </w:rPr>
         <w:pict w14:anchorId="47A99C95">
-          <v:rect id="_x0000_i1039" style="width:0;height:1.5pt" o:hralign="center" o:hrstd="t" o:hr="t" fillcolor="#a0a0a0" stroked="f"/>
+          <v:rect id="_x0000_i1031" style="width:0;height:1.5pt" o:hralign="center" o:hrstd="t" o:hr="t" fillcolor="#a0a0a0" stroked="f"/>
         </w:pict>
       </w:r>
     </w:p>
@@ -2014,7 +2014,7 @@
           <w:lang w:eastAsia="ru-RU"/>
         </w:rPr>
         <w:pict w14:anchorId="50E8EC53">
-          <v:rect id="_x0000_i1040" style="width:0;height:1.5pt" o:hralign="center" o:hrstd="t" o:hr="t" fillcolor="#a0a0a0" stroked="f"/>
+          <v:rect id="_x0000_i1032" style="width:0;height:1.5pt" o:hralign="center" o:hrstd="t" o:hr="t" fillcolor="#a0a0a0" stroked="f"/>
         </w:pict>
       </w:r>
     </w:p>
@@ -2213,7 +2213,7 @@
           <w:lang w:eastAsia="ru-RU"/>
         </w:rPr>
         <w:pict w14:anchorId="12BF1115">
-          <v:rect id="_x0000_i1041" style="width:0;height:1.5pt" o:hralign="center" o:hrstd="t" o:hr="t" fillcolor="#a0a0a0" stroked="f"/>
+          <v:rect id="_x0000_i1033" style="width:0;height:1.5pt" o:hralign="center" o:hrstd="t" o:hr="t" fillcolor="#a0a0a0" stroked="f"/>
         </w:pict>
       </w:r>
     </w:p>
@@ -2293,7 +2293,7 @@
           <w:lang w:eastAsia="ru-RU"/>
         </w:rPr>
         <w:pict w14:anchorId="46FF1FCE">
-          <v:rect id="_x0000_i1042" style="width:0;height:1.5pt" o:hralign="center" o:hrstd="t" o:hr="t" fillcolor="#a0a0a0" stroked="f"/>
+          <v:rect id="_x0000_i1034" style="width:0;height:1.5pt" o:hralign="center" o:hrstd="t" o:hr="t" fillcolor="#a0a0a0" stroked="f"/>
         </w:pict>
       </w:r>
     </w:p>
@@ -2454,7 +2454,7 @@
           <w:lang w:eastAsia="ru-RU"/>
         </w:rPr>
         <w:pict w14:anchorId="4548AADE">
-          <v:rect id="_x0000_i1029" style="width:0;height:1.5pt" o:hralign="center" o:hrstd="t" o:hr="t" fillcolor="#a0a0a0" stroked="f"/>
+          <v:rect id="_x0000_i1035" style="width:0;height:1.5pt" o:hralign="center" o:hrstd="t" o:hr="t" fillcolor="#a0a0a0" stroked="f"/>
         </w:pict>
       </w:r>
     </w:p>
@@ -2924,7 +2924,7 @@
           <w:lang w:eastAsia="ru-RU"/>
         </w:rPr>
         <w:pict w14:anchorId="0FCFE62F">
-          <v:rect id="_x0000_i1030" style="width:0;height:1.5pt" o:hralign="center" o:hrstd="t" o:hr="t" fillcolor="#a0a0a0" stroked="f"/>
+          <v:rect id="_x0000_i1036" style="width:0;height:1.5pt" o:hralign="center" o:hrstd="t" o:hr="t" fillcolor="#a0a0a0" stroked="f"/>
         </w:pict>
       </w:r>
     </w:p>
@@ -3200,7 +3200,7 @@
           <w:lang w:eastAsia="ru-RU"/>
         </w:rPr>
         <w:pict w14:anchorId="35BE6341">
-          <v:rect id="_x0000_i1031" style="width:0;height:1.5pt" o:hralign="center" o:hrstd="t" o:hr="t" fillcolor="#a0a0a0" stroked="f"/>
+          <v:rect id="_x0000_i1037" style="width:0;height:1.5pt" o:hralign="center" o:hrstd="t" o:hr="t" fillcolor="#a0a0a0" stroked="f"/>
         </w:pict>
       </w:r>
     </w:p>
@@ -3378,7 +3378,7 @@
           <w:lang w:eastAsia="ru-RU"/>
         </w:rPr>
         <w:pict w14:anchorId="63F287B5">
-          <v:rect id="_x0000_i1032" style="width:0;height:1.5pt" o:hralign="center" o:hrstd="t" o:hr="t" fillcolor="#a0a0a0" stroked="f"/>
+          <v:rect id="_x0000_i1038" style="width:0;height:1.5pt" o:hralign="center" o:hrstd="t" o:hr="t" fillcolor="#a0a0a0" stroked="f"/>
         </w:pict>
       </w:r>
     </w:p>
@@ -3707,7 +3707,7 @@
           <w:lang w:eastAsia="ru-RU"/>
         </w:rPr>
         <w:pict w14:anchorId="6A4D1573">
-          <v:rect id="_x0000_i1033" style="width:0;height:1.5pt" o:hralign="center" o:hrstd="t" o:hr="t" fillcolor="#a0a0a0" stroked="f"/>
+          <v:rect id="_x0000_i1039" style="width:0;height:1.5pt" o:hralign="center" o:hrstd="t" o:hr="t" fillcolor="#a0a0a0" stroked="f"/>
         </w:pict>
       </w:r>
     </w:p>
@@ -3989,7 +3989,7 @@
           <w:lang w:eastAsia="ru-RU"/>
         </w:rPr>
         <w:pict w14:anchorId="2A3CCFCB">
-          <v:rect id="_x0000_i1034" style="width:0;height:1.5pt" o:hralign="center" o:hrstd="t" o:hr="t" fillcolor="#a0a0a0" stroked="f"/>
+          <v:rect id="_x0000_i1040" style="width:0;height:1.5pt" o:hralign="center" o:hrstd="t" o:hr="t" fillcolor="#a0a0a0" stroked="f"/>
         </w:pict>
       </w:r>
     </w:p>
@@ -4143,7 +4143,7 @@
           <w:lang w:eastAsia="ru-RU"/>
         </w:rPr>
         <w:pict w14:anchorId="79FC719D">
-          <v:rect id="_x0000_i1035" style="width:0;height:1.5pt" o:hralign="center" o:hrstd="t" o:hr="t" fillcolor="#a0a0a0" stroked="f"/>
+          <v:rect id="_x0000_i1041" style="width:0;height:1.5pt" o:hralign="center" o:hrstd="t" o:hr="t" fillcolor="#a0a0a0" stroked="f"/>
         </w:pict>
       </w:r>
     </w:p>
@@ -4590,6 +4590,111 @@
     </w:tbl>
     <w:p>
       <w:pPr>
+        <w:pStyle w:val="a3"/>
+      </w:pPr>
+      <w:r>
+        <w:br/>
+      </w:r>
+      <w:r>
+        <w:br/>
+      </w:r>
+      <w:r>
+        <w:br/>
+      </w:r>
+      <w:r>
+        <w:br/>
+      </w:r>
+      <w:r>
+        <w:br/>
+      </w:r>
+      <w:r>
+        <w:br/>
+      </w:r>
+      <w:r>
+        <w:br/>
+      </w:r>
+      <w:r>
+        <w:br/>
+      </w:r>
+      <w:r>
+        <w:br/>
+      </w:r>
+      <w:r>
+        <w:br/>
+      </w:r>
+      <w:r>
+        <w:br/>
+      </w:r>
+      <w:r>
+        <w:br/>
+      </w:r>
+      <w:r>
+        <w:br/>
+      </w:r>
+      <w:r>
+        <w:br/>
+      </w:r>
+      <w:r>
+        <w:br/>
+      </w:r>
+      <w:r>
+        <w:br/>
+      </w:r>
+      <w:r>
+        <w:br/>
+      </w:r>
+      <w:r>
+        <w:br/>
+      </w:r>
+      <w:r>
+        <w:br/>
+      </w:r>
+      <w:r>
+        <w:br/>
+      </w:r>
+      <w:r>
+        <w:lastRenderedPageBreak/>
+        <w:br/>
+      </w:r>
+      <w:r>
+        <w:br/>
+      </w:r>
+      <w:r>
+        <w:br/>
+      </w:r>
+      <w:r>
+        <w:br/>
+      </w:r>
+      <w:r>
+        <w:br/>
+      </w:r>
+      <w:r>
+        <w:br/>
+      </w:r>
+      <w:r>
+        <w:br/>
+      </w:r>
+      <w:r>
+        <w:br/>
+      </w:r>
+      <w:r>
+        <w:br/>
+      </w:r>
+      <w:r>
+        <w:br/>
+      </w:r>
+      <w:r>
+        <w:br/>
+      </w:r>
+      <w:r>
+        <w:br/>
+      </w:r>
+      <w:r>
+        <w:br/>
+      </w:r>
+    </w:p>
+    <w:p>
+      <w:pPr>
         <w:spacing w:after="0" w:line="240" w:lineRule="auto"/>
         <w:rPr>
           <w:rFonts w:ascii="Times New Roman" w:eastAsia="Times New Roman" w:hAnsi="Times New Roman" w:cs="Times New Roman"/>
@@ -4605,10 +4710,856 @@
           <w:szCs w:val="24"/>
           <w:lang w:eastAsia="ru-RU"/>
         </w:rPr>
-        <w:pict w14:anchorId="649F9030">
-          <v:rect id="_x0000_i1036" style="width:0;height:1.5pt" o:hralign="center" o:hrstd="t" o:hr="t" fillcolor="#a0a0a0" stroked="f"/>
+        <w:pict w14:anchorId="7F9ACE36">
+          <v:rect id="_x0000_i1045" style="width:0;height:1.5pt" o:hralign="center" o:hrstd="t" o:hr="t" fillcolor="#a0a0a0" stroked="f"/>
         </w:pict>
       </w:r>
+    </w:p>
+    <w:p>
+      <w:pPr>
+        <w:spacing w:before="100" w:beforeAutospacing="1" w:after="100" w:afterAutospacing="1" w:line="240" w:lineRule="auto"/>
+        <w:outlineLvl w:val="2"/>
+        <w:rPr>
+          <w:rFonts w:ascii="Times New Roman" w:eastAsia="Times New Roman" w:hAnsi="Times New Roman" w:cs="Times New Roman"/>
+          <w:b/>
+          <w:bCs/>
+          <w:sz w:val="27"/>
+          <w:szCs w:val="27"/>
+          <w:lang w:eastAsia="ru-RU"/>
+        </w:rPr>
+      </w:pPr>
+      <w:r>
+        <w:rPr>
+          <w:rFonts w:ascii="Times New Roman" w:eastAsia="Times New Roman" w:hAnsi="Times New Roman" w:cs="Times New Roman"/>
+          <w:b/>
+          <w:bCs/>
+          <w:sz w:val="27"/>
+          <w:szCs w:val="27"/>
+          <w:lang w:eastAsia="ru-RU"/>
+        </w:rPr>
+        <w:t>2️</w:t>
+      </w:r>
+      <w:r>
+        <w:rPr>
+          <w:rFonts w:ascii="Tahoma" w:eastAsia="Times New Roman" w:hAnsi="Tahoma" w:cs="Tahoma"/>
+          <w:b/>
+          <w:bCs/>
+          <w:sz w:val="27"/>
+          <w:szCs w:val="27"/>
+          <w:lang w:eastAsia="ru-RU"/>
+        </w:rPr>
+        <w:t>⃣</w:t>
+      </w:r>
+      <w:r>
+        <w:rPr>
+          <w:rFonts w:ascii="Times New Roman" w:eastAsia="Times New Roman" w:hAnsi="Times New Roman" w:cs="Times New Roman"/>
+          <w:b/>
+          <w:bCs/>
+          <w:sz w:val="27"/>
+          <w:szCs w:val="27"/>
+          <w:lang w:eastAsia="ru-RU"/>
+        </w:rPr>
+        <w:t xml:space="preserve"> Завершення деплою</w:t>
+      </w:r>
+    </w:p>
+    <w:p>
+      <w:pPr>
+        <w:spacing w:before="100" w:beforeAutospacing="1" w:after="100" w:afterAutospacing="1" w:line="240" w:lineRule="auto"/>
+        <w:rPr>
+          <w:rFonts w:ascii="Times New Roman" w:eastAsia="Times New Roman" w:hAnsi="Times New Roman" w:cs="Times New Roman"/>
+          <w:sz w:val="24"/>
+          <w:szCs w:val="24"/>
+          <w:lang w:eastAsia="ru-RU"/>
+        </w:rPr>
+      </w:pPr>
+      <w:r>
+        <w:rPr>
+          <w:rFonts w:ascii="Times New Roman" w:eastAsia="Times New Roman" w:hAnsi="Times New Roman" w:cs="Times New Roman"/>
+          <w:sz w:val="24"/>
+          <w:szCs w:val="24"/>
+          <w:lang w:eastAsia="ru-RU"/>
+        </w:rPr>
+        <w:t>Щоб закінчити процес і мати чистий production:</w:t>
+      </w:r>
+    </w:p>
+    <w:p>
+      <w:pPr>
+        <w:numPr>
+          <w:ilvl w:val="0"/>
+          <w:numId w:val="13"/>
+        </w:numPr>
+        <w:spacing w:before="100" w:beforeAutospacing="1" w:after="100" w:afterAutospacing="1" w:line="240" w:lineRule="auto"/>
+        <w:rPr>
+          <w:rFonts w:ascii="Times New Roman" w:eastAsia="Times New Roman" w:hAnsi="Times New Roman" w:cs="Times New Roman"/>
+          <w:sz w:val="24"/>
+          <w:szCs w:val="24"/>
+          <w:lang w:eastAsia="ru-RU"/>
+        </w:rPr>
+      </w:pPr>
+      <w:r>
+        <w:rPr>
+          <w:rFonts w:ascii="Times New Roman" w:eastAsia="Times New Roman" w:hAnsi="Times New Roman" w:cs="Times New Roman"/>
+          <w:sz w:val="24"/>
+          <w:szCs w:val="24"/>
+          <w:lang w:eastAsia="ru-RU"/>
+        </w:rPr>
+        <w:t>Переконайся, що всі зміни в локальному репозиторії:</w:t>
+      </w:r>
+    </w:p>
+    <w:p>
+      <w:pPr>
+        <w:tabs>
+          <w:tab w:val="left" w:pos="916"/>
+          <w:tab w:val="left" w:pos="1832"/>
+          <w:tab w:val="left" w:pos="2748"/>
+          <w:tab w:val="left" w:pos="3664"/>
+          <w:tab w:val="left" w:pos="4580"/>
+          <w:tab w:val="left" w:pos="5496"/>
+          <w:tab w:val="left" w:pos="6412"/>
+          <w:tab w:val="left" w:pos="7328"/>
+          <w:tab w:val="left" w:pos="8244"/>
+          <w:tab w:val="left" w:pos="9160"/>
+          <w:tab w:val="left" w:pos="10076"/>
+          <w:tab w:val="left" w:pos="10992"/>
+          <w:tab w:val="left" w:pos="11908"/>
+          <w:tab w:val="left" w:pos="12824"/>
+          <w:tab w:val="left" w:pos="13740"/>
+          <w:tab w:val="left" w:pos="14656"/>
+        </w:tabs>
+        <w:spacing w:after="0" w:line="240" w:lineRule="auto"/>
+        <w:rPr>
+          <w:rFonts w:ascii="Courier New" w:eastAsia="Times New Roman" w:hAnsi="Courier New" w:cs="Courier New"/>
+          <w:sz w:val="20"/>
+          <w:szCs w:val="20"/>
+          <w:lang w:eastAsia="ru-RU"/>
+        </w:rPr>
+      </w:pPr>
+      <w:r>
+        <w:rPr>
+          <w:rFonts w:ascii="Courier New" w:eastAsia="Times New Roman" w:hAnsi="Courier New" w:cs="Courier New"/>
+          <w:sz w:val="20"/>
+          <w:szCs w:val="20"/>
+          <w:lang w:eastAsia="ru-RU"/>
+        </w:rPr>
+        <w:t>git status</w:t>
+      </w:r>
+    </w:p>
+    <w:p>
+      <w:pPr>
+        <w:numPr>
+          <w:ilvl w:val="0"/>
+          <w:numId w:val="14"/>
+        </w:numPr>
+        <w:spacing w:before="100" w:beforeAutospacing="1" w:after="100" w:afterAutospacing="1" w:line="240" w:lineRule="auto"/>
+        <w:rPr>
+          <w:rFonts w:ascii="Times New Roman" w:eastAsia="Times New Roman" w:hAnsi="Times New Roman" w:cs="Times New Roman"/>
+          <w:sz w:val="24"/>
+          <w:szCs w:val="24"/>
+          <w:lang w:eastAsia="ru-RU"/>
+        </w:rPr>
+      </w:pPr>
+      <w:r>
+        <w:rPr>
+          <w:rFonts w:ascii="Times New Roman" w:eastAsia="Times New Roman" w:hAnsi="Times New Roman" w:cs="Times New Roman"/>
+          <w:sz w:val="24"/>
+          <w:szCs w:val="24"/>
+          <w:lang w:eastAsia="ru-RU"/>
+        </w:rPr>
+        <w:t xml:space="preserve">Якщо є </w:t>
+      </w:r>
+      <w:r>
+        <w:rPr>
+          <w:rFonts w:ascii="Courier New" w:eastAsia="Times New Roman" w:hAnsi="Courier New" w:cs="Courier New"/>
+          <w:sz w:val="20"/>
+          <w:szCs w:val="20"/>
+          <w:lang w:eastAsia="ru-RU"/>
+        </w:rPr>
+        <w:t>Changes not staged for commit</w:t>
+      </w:r>
+      <w:r>
+        <w:rPr>
+          <w:rFonts w:ascii="Times New Roman" w:eastAsia="Times New Roman" w:hAnsi="Times New Roman" w:cs="Times New Roman"/>
+          <w:sz w:val="24"/>
+          <w:szCs w:val="24"/>
+          <w:lang w:eastAsia="ru-RU"/>
+        </w:rPr>
+        <w:t>, додай їх:</w:t>
+      </w:r>
+    </w:p>
+    <w:p>
+      <w:pPr>
+        <w:tabs>
+          <w:tab w:val="left" w:pos="916"/>
+          <w:tab w:val="left" w:pos="1832"/>
+          <w:tab w:val="left" w:pos="2748"/>
+          <w:tab w:val="left" w:pos="3664"/>
+          <w:tab w:val="left" w:pos="4580"/>
+          <w:tab w:val="left" w:pos="5496"/>
+          <w:tab w:val="left" w:pos="6412"/>
+          <w:tab w:val="left" w:pos="7328"/>
+          <w:tab w:val="left" w:pos="8244"/>
+          <w:tab w:val="left" w:pos="9160"/>
+          <w:tab w:val="left" w:pos="10076"/>
+          <w:tab w:val="left" w:pos="10992"/>
+          <w:tab w:val="left" w:pos="11908"/>
+          <w:tab w:val="left" w:pos="12824"/>
+          <w:tab w:val="left" w:pos="13740"/>
+          <w:tab w:val="left" w:pos="14656"/>
+        </w:tabs>
+        <w:spacing w:after="0" w:line="240" w:lineRule="auto"/>
+        <w:rPr>
+          <w:rFonts w:ascii="Courier New" w:eastAsia="Times New Roman" w:hAnsi="Courier New" w:cs="Courier New"/>
+          <w:sz w:val="20"/>
+          <w:szCs w:val="20"/>
+          <w:lang w:eastAsia="ru-RU"/>
+        </w:rPr>
+      </w:pPr>
+      <w:r>
+        <w:rPr>
+          <w:rFonts w:ascii="Courier New" w:eastAsia="Times New Roman" w:hAnsi="Courier New" w:cs="Courier New"/>
+          <w:sz w:val="20"/>
+          <w:szCs w:val="20"/>
+          <w:lang w:eastAsia="ru-RU"/>
+        </w:rPr>
+        <w:t>git add .</w:t>
+      </w:r>
+    </w:p>
+    <w:p>
+      <w:pPr>
+        <w:tabs>
+          <w:tab w:val="left" w:pos="916"/>
+          <w:tab w:val="left" w:pos="1832"/>
+          <w:tab w:val="left" w:pos="2748"/>
+          <w:tab w:val="left" w:pos="3664"/>
+          <w:tab w:val="left" w:pos="4580"/>
+          <w:tab w:val="left" w:pos="5496"/>
+          <w:tab w:val="left" w:pos="6412"/>
+          <w:tab w:val="left" w:pos="7328"/>
+          <w:tab w:val="left" w:pos="8244"/>
+          <w:tab w:val="left" w:pos="9160"/>
+          <w:tab w:val="left" w:pos="10076"/>
+          <w:tab w:val="left" w:pos="10992"/>
+          <w:tab w:val="left" w:pos="11908"/>
+          <w:tab w:val="left" w:pos="12824"/>
+          <w:tab w:val="left" w:pos="13740"/>
+          <w:tab w:val="left" w:pos="14656"/>
+        </w:tabs>
+        <w:spacing w:after="0" w:line="240" w:lineRule="auto"/>
+        <w:rPr>
+          <w:rFonts w:ascii="Courier New" w:eastAsia="Times New Roman" w:hAnsi="Courier New" w:cs="Courier New"/>
+          <w:sz w:val="20"/>
+          <w:szCs w:val="20"/>
+          <w:lang w:eastAsia="ru-RU"/>
+        </w:rPr>
+      </w:pPr>
+      <w:r>
+        <w:rPr>
+          <w:rFonts w:ascii="Courier New" w:eastAsia="Times New Roman" w:hAnsi="Courier New" w:cs="Courier New"/>
+          <w:sz w:val="20"/>
+          <w:szCs w:val="20"/>
+          <w:lang w:eastAsia="ru-RU"/>
+        </w:rPr>
+        <w:t>git commit -m "Final production update"</w:t>
+      </w:r>
+    </w:p>
+    <w:p>
+      <w:pPr>
+        <w:numPr>
+          <w:ilvl w:val="0"/>
+          <w:numId w:val="15"/>
+        </w:numPr>
+        <w:spacing w:before="100" w:beforeAutospacing="1" w:after="100" w:afterAutospacing="1" w:line="240" w:lineRule="auto"/>
+        <w:rPr>
+          <w:rFonts w:ascii="Times New Roman" w:eastAsia="Times New Roman" w:hAnsi="Times New Roman" w:cs="Times New Roman"/>
+          <w:sz w:val="24"/>
+          <w:szCs w:val="24"/>
+          <w:lang w:eastAsia="ru-RU"/>
+        </w:rPr>
+      </w:pPr>
+      <w:r>
+        <w:rPr>
+          <w:rFonts w:ascii="Times New Roman" w:eastAsia="Times New Roman" w:hAnsi="Times New Roman" w:cs="Times New Roman"/>
+          <w:sz w:val="24"/>
+          <w:szCs w:val="24"/>
+          <w:lang w:eastAsia="ru-RU"/>
+        </w:rPr>
+        <w:t xml:space="preserve">Push на основну гілку </w:t>
+      </w:r>
+      <w:r>
+        <w:rPr>
+          <w:rFonts w:ascii="Courier New" w:eastAsia="Times New Roman" w:hAnsi="Courier New" w:cs="Courier New"/>
+          <w:sz w:val="20"/>
+          <w:szCs w:val="20"/>
+          <w:lang w:eastAsia="ru-RU"/>
+        </w:rPr>
+        <w:t>main</w:t>
+      </w:r>
+      <w:r>
+        <w:rPr>
+          <w:rFonts w:ascii="Times New Roman" w:eastAsia="Times New Roman" w:hAnsi="Times New Roman" w:cs="Times New Roman"/>
+          <w:sz w:val="24"/>
+          <w:szCs w:val="24"/>
+          <w:lang w:eastAsia="ru-RU"/>
+        </w:rPr>
+        <w:t>:</w:t>
+      </w:r>
+    </w:p>
+    <w:p>
+      <w:pPr>
+        <w:tabs>
+          <w:tab w:val="left" w:pos="916"/>
+          <w:tab w:val="left" w:pos="1832"/>
+          <w:tab w:val="left" w:pos="2748"/>
+          <w:tab w:val="left" w:pos="3664"/>
+          <w:tab w:val="left" w:pos="4580"/>
+          <w:tab w:val="left" w:pos="5496"/>
+          <w:tab w:val="left" w:pos="6412"/>
+          <w:tab w:val="left" w:pos="7328"/>
+          <w:tab w:val="left" w:pos="8244"/>
+          <w:tab w:val="left" w:pos="9160"/>
+          <w:tab w:val="left" w:pos="10076"/>
+          <w:tab w:val="left" w:pos="10992"/>
+          <w:tab w:val="left" w:pos="11908"/>
+          <w:tab w:val="left" w:pos="12824"/>
+          <w:tab w:val="left" w:pos="13740"/>
+          <w:tab w:val="left" w:pos="14656"/>
+        </w:tabs>
+        <w:spacing w:after="0" w:line="240" w:lineRule="auto"/>
+        <w:rPr>
+          <w:rFonts w:ascii="Courier New" w:eastAsia="Times New Roman" w:hAnsi="Courier New" w:cs="Courier New"/>
+          <w:sz w:val="20"/>
+          <w:szCs w:val="20"/>
+          <w:lang w:eastAsia="ru-RU"/>
+        </w:rPr>
+      </w:pPr>
+      <w:r>
+        <w:rPr>
+          <w:rFonts w:ascii="Courier New" w:eastAsia="Times New Roman" w:hAnsi="Courier New" w:cs="Courier New"/>
+          <w:sz w:val="20"/>
+          <w:szCs w:val="20"/>
+          <w:lang w:eastAsia="ru-RU"/>
+        </w:rPr>
+        <w:t>git push origin main</w:t>
+      </w:r>
+    </w:p>
+    <w:p>
+      <w:pPr>
+        <w:numPr>
+          <w:ilvl w:val="0"/>
+          <w:numId w:val="16"/>
+        </w:numPr>
+        <w:spacing w:before="100" w:beforeAutospacing="1" w:after="100" w:afterAutospacing="1" w:line="240" w:lineRule="auto"/>
+        <w:rPr>
+          <w:rFonts w:ascii="Times New Roman" w:eastAsia="Times New Roman" w:hAnsi="Times New Roman" w:cs="Times New Roman"/>
+          <w:sz w:val="24"/>
+          <w:szCs w:val="24"/>
+          <w:lang w:eastAsia="ru-RU"/>
+        </w:rPr>
+      </w:pPr>
+      <w:r>
+        <w:rPr>
+          <w:rFonts w:ascii="Times New Roman" w:eastAsia="Times New Roman" w:hAnsi="Times New Roman" w:cs="Times New Roman"/>
+          <w:sz w:val="24"/>
+          <w:szCs w:val="24"/>
+          <w:lang w:eastAsia="ru-RU"/>
+        </w:rPr>
+        <w:t>Якщо виникають конфлікти, можна спочатку зробити:</w:t>
+      </w:r>
+    </w:p>
+    <w:p>
+      <w:pPr>
+        <w:tabs>
+          <w:tab w:val="left" w:pos="916"/>
+          <w:tab w:val="left" w:pos="1832"/>
+          <w:tab w:val="left" w:pos="2748"/>
+          <w:tab w:val="left" w:pos="3664"/>
+          <w:tab w:val="left" w:pos="4580"/>
+          <w:tab w:val="left" w:pos="5496"/>
+          <w:tab w:val="left" w:pos="6412"/>
+          <w:tab w:val="left" w:pos="7328"/>
+          <w:tab w:val="left" w:pos="8244"/>
+          <w:tab w:val="left" w:pos="9160"/>
+          <w:tab w:val="left" w:pos="10076"/>
+          <w:tab w:val="left" w:pos="10992"/>
+          <w:tab w:val="left" w:pos="11908"/>
+          <w:tab w:val="left" w:pos="12824"/>
+          <w:tab w:val="left" w:pos="13740"/>
+          <w:tab w:val="left" w:pos="14656"/>
+        </w:tabs>
+        <w:spacing w:after="0" w:line="240" w:lineRule="auto"/>
+        <w:rPr>
+          <w:rFonts w:ascii="Courier New" w:eastAsia="Times New Roman" w:hAnsi="Courier New" w:cs="Courier New"/>
+          <w:sz w:val="20"/>
+          <w:szCs w:val="20"/>
+          <w:lang w:eastAsia="ru-RU"/>
+        </w:rPr>
+      </w:pPr>
+      <w:r>
+        <w:rPr>
+          <w:rFonts w:ascii="Courier New" w:eastAsia="Times New Roman" w:hAnsi="Courier New" w:cs="Courier New"/>
+          <w:sz w:val="20"/>
+          <w:szCs w:val="20"/>
+          <w:lang w:eastAsia="ru-RU"/>
+        </w:rPr>
+        <w:t>git pull origin main --rebase</w:t>
+      </w:r>
+    </w:p>
+    <w:p>
+      <w:pPr>
+        <w:tabs>
+          <w:tab w:val="left" w:pos="916"/>
+          <w:tab w:val="left" w:pos="1832"/>
+          <w:tab w:val="left" w:pos="2748"/>
+          <w:tab w:val="left" w:pos="3664"/>
+          <w:tab w:val="left" w:pos="4580"/>
+          <w:tab w:val="left" w:pos="5496"/>
+          <w:tab w:val="left" w:pos="6412"/>
+          <w:tab w:val="left" w:pos="7328"/>
+          <w:tab w:val="left" w:pos="8244"/>
+          <w:tab w:val="left" w:pos="9160"/>
+          <w:tab w:val="left" w:pos="10076"/>
+          <w:tab w:val="left" w:pos="10992"/>
+          <w:tab w:val="left" w:pos="11908"/>
+          <w:tab w:val="left" w:pos="12824"/>
+          <w:tab w:val="left" w:pos="13740"/>
+          <w:tab w:val="left" w:pos="14656"/>
+        </w:tabs>
+        <w:spacing w:after="0" w:line="240" w:lineRule="auto"/>
+        <w:rPr>
+          <w:rFonts w:ascii="Courier New" w:eastAsia="Times New Roman" w:hAnsi="Courier New" w:cs="Courier New"/>
+          <w:sz w:val="20"/>
+          <w:szCs w:val="20"/>
+          <w:lang w:eastAsia="ru-RU"/>
+        </w:rPr>
+      </w:pPr>
+      <w:r>
+        <w:rPr>
+          <w:rFonts w:ascii="Courier New" w:eastAsia="Times New Roman" w:hAnsi="Courier New" w:cs="Courier New"/>
+          <w:sz w:val="20"/>
+          <w:szCs w:val="20"/>
+          <w:lang w:eastAsia="ru-RU"/>
+        </w:rPr>
+        <w:t>git push origin main</w:t>
+      </w:r>
+    </w:p>
+    <w:p>
+      <w:pPr>
+        <w:numPr>
+          <w:ilvl w:val="0"/>
+          <w:numId w:val="17"/>
+        </w:numPr>
+        <w:spacing w:before="100" w:beforeAutospacing="1" w:after="100" w:afterAutospacing="1" w:line="240" w:lineRule="auto"/>
+        <w:rPr>
+          <w:rFonts w:ascii="Times New Roman" w:eastAsia="Times New Roman" w:hAnsi="Times New Roman" w:cs="Times New Roman"/>
+          <w:sz w:val="24"/>
+          <w:szCs w:val="24"/>
+          <w:lang w:eastAsia="ru-RU"/>
+        </w:rPr>
+      </w:pPr>
+      <w:r>
+        <w:rPr>
+          <w:rFonts w:ascii="Times New Roman" w:eastAsia="Times New Roman" w:hAnsi="Times New Roman" w:cs="Times New Roman"/>
+          <w:sz w:val="24"/>
+          <w:szCs w:val="24"/>
+          <w:lang w:eastAsia="ru-RU"/>
+        </w:rPr>
+        <w:t>Деплой на Vercel як production:</w:t>
+      </w:r>
+    </w:p>
+    <w:p>
+      <w:pPr>
+        <w:tabs>
+          <w:tab w:val="left" w:pos="916"/>
+          <w:tab w:val="left" w:pos="1832"/>
+          <w:tab w:val="left" w:pos="2748"/>
+          <w:tab w:val="left" w:pos="3664"/>
+          <w:tab w:val="left" w:pos="4580"/>
+          <w:tab w:val="left" w:pos="5496"/>
+          <w:tab w:val="left" w:pos="6412"/>
+          <w:tab w:val="left" w:pos="7328"/>
+          <w:tab w:val="left" w:pos="8244"/>
+          <w:tab w:val="left" w:pos="9160"/>
+          <w:tab w:val="left" w:pos="10076"/>
+          <w:tab w:val="left" w:pos="10992"/>
+          <w:tab w:val="left" w:pos="11908"/>
+          <w:tab w:val="left" w:pos="12824"/>
+          <w:tab w:val="left" w:pos="13740"/>
+          <w:tab w:val="left" w:pos="14656"/>
+        </w:tabs>
+        <w:spacing w:after="0" w:line="240" w:lineRule="auto"/>
+        <w:rPr>
+          <w:rFonts w:ascii="Courier New" w:eastAsia="Times New Roman" w:hAnsi="Courier New" w:cs="Courier New"/>
+          <w:sz w:val="20"/>
+          <w:szCs w:val="20"/>
+          <w:lang w:eastAsia="ru-RU"/>
+        </w:rPr>
+      </w:pPr>
+      <w:r>
+        <w:rPr>
+          <w:rFonts w:ascii="Courier New" w:eastAsia="Times New Roman" w:hAnsi="Courier New" w:cs="Courier New"/>
+          <w:sz w:val="20"/>
+          <w:szCs w:val="20"/>
+          <w:lang w:eastAsia="ru-RU"/>
+        </w:rPr>
+        <w:t>vercel --prod</w:t>
+      </w:r>
+    </w:p>
+    <w:p>
+      <w:pPr>
+        <w:numPr>
+          <w:ilvl w:val="0"/>
+          <w:numId w:val="18"/>
+        </w:numPr>
+        <w:spacing w:before="100" w:beforeAutospacing="1" w:after="100" w:afterAutospacing="1" w:line="240" w:lineRule="auto"/>
+        <w:rPr>
+          <w:rFonts w:ascii="Times New Roman" w:eastAsia="Times New Roman" w:hAnsi="Times New Roman" w:cs="Times New Roman"/>
+          <w:sz w:val="24"/>
+          <w:szCs w:val="24"/>
+          <w:lang w:eastAsia="ru-RU"/>
+        </w:rPr>
+      </w:pPr>
+      <w:r>
+        <w:rPr>
+          <w:rFonts w:ascii="Times New Roman" w:eastAsia="Times New Roman" w:hAnsi="Times New Roman" w:cs="Times New Roman"/>
+          <w:sz w:val="24"/>
+          <w:szCs w:val="24"/>
+          <w:lang w:eastAsia="ru-RU"/>
+        </w:rPr>
+        <w:t>Vercel автоматично оновить production-деплой.</w:t>
+      </w:r>
+    </w:p>
+    <w:p>
+      <w:pPr>
+        <w:numPr>
+          <w:ilvl w:val="0"/>
+          <w:numId w:val="18"/>
+        </w:numPr>
+        <w:spacing w:before="100" w:beforeAutospacing="1" w:after="100" w:afterAutospacing="1" w:line="240" w:lineRule="auto"/>
+        <w:rPr>
+          <w:rFonts w:ascii="Times New Roman" w:eastAsia="Times New Roman" w:hAnsi="Times New Roman" w:cs="Times New Roman"/>
+          <w:sz w:val="24"/>
+          <w:szCs w:val="24"/>
+          <w:lang w:eastAsia="ru-RU"/>
+        </w:rPr>
+      </w:pPr>
+      <w:r>
+        <w:rPr>
+          <w:rFonts w:ascii="Times New Roman" w:eastAsia="Times New Roman" w:hAnsi="Times New Roman" w:cs="Times New Roman"/>
+          <w:sz w:val="24"/>
+          <w:szCs w:val="24"/>
+          <w:lang w:eastAsia="ru-RU"/>
+        </w:rPr>
+        <w:t xml:space="preserve">Короткий alias </w:t>
+      </w:r>
+      <w:r>
+        <w:rPr>
+          <w:rFonts w:ascii="Courier New" w:eastAsia="Times New Roman" w:hAnsi="Courier New" w:cs="Courier New"/>
+          <w:sz w:val="20"/>
+          <w:szCs w:val="20"/>
+          <w:lang w:eastAsia="ru-RU"/>
+        </w:rPr>
+        <w:t>e-plan.vercel.app</w:t>
+      </w:r>
+      <w:r>
+        <w:rPr>
+          <w:rFonts w:ascii="Times New Roman" w:eastAsia="Times New Roman" w:hAnsi="Times New Roman" w:cs="Times New Roman"/>
+          <w:sz w:val="24"/>
+          <w:szCs w:val="24"/>
+          <w:lang w:eastAsia="ru-RU"/>
+        </w:rPr>
+        <w:t xml:space="preserve"> буде вказувати на останній деплой.</w:t>
+      </w:r>
+    </w:p>
+    <w:p>
+      <w:pPr>
+        <w:spacing w:after="0" w:line="240" w:lineRule="auto"/>
+        <w:rPr>
+          <w:rFonts w:ascii="Times New Roman" w:eastAsia="Times New Roman" w:hAnsi="Times New Roman" w:cs="Times New Roman"/>
+          <w:sz w:val="24"/>
+          <w:szCs w:val="24"/>
+          <w:lang w:eastAsia="ru-RU"/>
+        </w:rPr>
+      </w:pPr>
+      <w:r>
+        <w:rPr>
+          <w:rFonts w:ascii="Times New Roman" w:eastAsia="Times New Roman" w:hAnsi="Times New Roman" w:cs="Times New Roman"/>
+          <w:sz w:val="24"/>
+          <w:szCs w:val="24"/>
+          <w:lang w:eastAsia="ru-RU"/>
+        </w:rPr>
+        <w:pict w14:anchorId="70E5EC05">
+          <v:rect id="_x0000_i1046" style="width:0;height:1.5pt" o:hralign="center" o:hrstd="t" o:hr="t" fillcolor="#a0a0a0" stroked="f"/>
+        </w:pict>
+      </w:r>
+    </w:p>
+    <w:p>
+      <w:pPr>
+        <w:spacing w:before="100" w:beforeAutospacing="1" w:after="100" w:afterAutospacing="1" w:line="240" w:lineRule="auto"/>
+        <w:outlineLvl w:val="2"/>
+        <w:rPr>
+          <w:rFonts w:ascii="Times New Roman" w:eastAsia="Times New Roman" w:hAnsi="Times New Roman" w:cs="Times New Roman"/>
+          <w:b/>
+          <w:bCs/>
+          <w:sz w:val="27"/>
+          <w:szCs w:val="27"/>
+          <w:lang w:eastAsia="ru-RU"/>
+        </w:rPr>
+      </w:pPr>
+      <w:r>
+        <w:rPr>
+          <w:rFonts w:ascii="Times New Roman" w:eastAsia="Times New Roman" w:hAnsi="Times New Roman" w:cs="Times New Roman"/>
+          <w:b/>
+          <w:bCs/>
+          <w:sz w:val="27"/>
+          <w:szCs w:val="27"/>
+          <w:lang w:eastAsia="ru-RU"/>
+        </w:rPr>
+        <w:t>3️</w:t>
+      </w:r>
+      <w:r>
+        <w:rPr>
+          <w:rFonts w:ascii="Tahoma" w:eastAsia="Times New Roman" w:hAnsi="Tahoma" w:cs="Tahoma"/>
+          <w:b/>
+          <w:bCs/>
+          <w:sz w:val="27"/>
+          <w:szCs w:val="27"/>
+          <w:lang w:eastAsia="ru-RU"/>
+        </w:rPr>
+        <w:t>⃣</w:t>
+      </w:r>
+      <w:r>
+        <w:rPr>
+          <w:rFonts w:ascii="Times New Roman" w:eastAsia="Times New Roman" w:hAnsi="Times New Roman" w:cs="Times New Roman"/>
+          <w:b/>
+          <w:bCs/>
+          <w:sz w:val="27"/>
+          <w:szCs w:val="27"/>
+          <w:lang w:eastAsia="ru-RU"/>
+        </w:rPr>
+        <w:t xml:space="preserve"> Після деплою</w:t>
+      </w:r>
+    </w:p>
+    <w:p>
+      <w:pPr>
+        <w:numPr>
+          <w:ilvl w:val="0"/>
+          <w:numId w:val="19"/>
+        </w:numPr>
+        <w:spacing w:before="100" w:beforeAutospacing="1" w:after="100" w:afterAutospacing="1" w:line="240" w:lineRule="auto"/>
+        <w:rPr>
+          <w:rFonts w:ascii="Times New Roman" w:eastAsia="Times New Roman" w:hAnsi="Times New Roman" w:cs="Times New Roman"/>
+          <w:sz w:val="24"/>
+          <w:szCs w:val="24"/>
+          <w:lang w:eastAsia="ru-RU"/>
+        </w:rPr>
+      </w:pPr>
+      <w:r>
+        <w:rPr>
+          <w:rFonts w:ascii="Times New Roman" w:eastAsia="Times New Roman" w:hAnsi="Times New Roman" w:cs="Times New Roman"/>
+          <w:sz w:val="24"/>
+          <w:szCs w:val="24"/>
+          <w:lang w:eastAsia="ru-RU"/>
+        </w:rPr>
+        <w:t>Перевірити статус:</w:t>
+      </w:r>
+    </w:p>
+    <w:p>
+      <w:pPr>
+        <w:tabs>
+          <w:tab w:val="left" w:pos="916"/>
+          <w:tab w:val="left" w:pos="1832"/>
+          <w:tab w:val="left" w:pos="2748"/>
+          <w:tab w:val="left" w:pos="3664"/>
+          <w:tab w:val="left" w:pos="4580"/>
+          <w:tab w:val="left" w:pos="5496"/>
+          <w:tab w:val="left" w:pos="6412"/>
+          <w:tab w:val="left" w:pos="7328"/>
+          <w:tab w:val="left" w:pos="8244"/>
+          <w:tab w:val="left" w:pos="9160"/>
+          <w:tab w:val="left" w:pos="10076"/>
+          <w:tab w:val="left" w:pos="10992"/>
+          <w:tab w:val="left" w:pos="11908"/>
+          <w:tab w:val="left" w:pos="12824"/>
+          <w:tab w:val="left" w:pos="13740"/>
+          <w:tab w:val="left" w:pos="14656"/>
+        </w:tabs>
+        <w:spacing w:after="0" w:line="240" w:lineRule="auto"/>
+        <w:rPr>
+          <w:rFonts w:ascii="Courier New" w:eastAsia="Times New Roman" w:hAnsi="Courier New" w:cs="Courier New"/>
+          <w:sz w:val="20"/>
+          <w:szCs w:val="20"/>
+          <w:lang w:eastAsia="ru-RU"/>
+        </w:rPr>
+      </w:pPr>
+      <w:r>
+        <w:rPr>
+          <w:rFonts w:ascii="Courier New" w:eastAsia="Times New Roman" w:hAnsi="Courier New" w:cs="Courier New"/>
+          <w:sz w:val="20"/>
+          <w:szCs w:val="20"/>
+          <w:lang w:eastAsia="ru-RU"/>
+        </w:rPr>
+        <w:t>vercel ls</w:t>
+      </w:r>
+    </w:p>
+    <w:p>
+      <w:pPr>
+        <w:numPr>
+          <w:ilvl w:val="0"/>
+          <w:numId w:val="20"/>
+        </w:numPr>
+        <w:spacing w:before="100" w:beforeAutospacing="1" w:after="100" w:afterAutospacing="1" w:line="240" w:lineRule="auto"/>
+        <w:rPr>
+          <w:rFonts w:ascii="Times New Roman" w:eastAsia="Times New Roman" w:hAnsi="Times New Roman" w:cs="Times New Roman"/>
+          <w:sz w:val="24"/>
+          <w:szCs w:val="24"/>
+          <w:lang w:eastAsia="ru-RU"/>
+        </w:rPr>
+      </w:pPr>
+      <w:r>
+        <w:rPr>
+          <w:rFonts w:ascii="Times New Roman" w:eastAsia="Times New Roman" w:hAnsi="Times New Roman" w:cs="Times New Roman"/>
+          <w:sz w:val="24"/>
+          <w:szCs w:val="24"/>
+          <w:lang w:eastAsia="ru-RU"/>
+        </w:rPr>
+        <w:t>Ти побачиш останні деплои, і під кожним буде короткий alias.</w:t>
+      </w:r>
+    </w:p>
+    <w:p>
+      <w:pPr>
+        <w:numPr>
+          <w:ilvl w:val="0"/>
+          <w:numId w:val="20"/>
+        </w:numPr>
+        <w:spacing w:before="100" w:beforeAutospacing="1" w:after="100" w:afterAutospacing="1" w:line="240" w:lineRule="auto"/>
+        <w:rPr>
+          <w:rFonts w:ascii="Times New Roman" w:eastAsia="Times New Roman" w:hAnsi="Times New Roman" w:cs="Times New Roman"/>
+          <w:sz w:val="24"/>
+          <w:szCs w:val="24"/>
+          <w:lang w:eastAsia="ru-RU"/>
+        </w:rPr>
+      </w:pPr>
+      <w:r>
+        <w:rPr>
+          <w:rFonts w:ascii="Times New Roman" w:eastAsia="Times New Roman" w:hAnsi="Times New Roman" w:cs="Times New Roman"/>
+          <w:sz w:val="24"/>
+          <w:szCs w:val="24"/>
+          <w:lang w:eastAsia="ru-RU"/>
+        </w:rPr>
+        <w:t xml:space="preserve">Основне посилання для користувачів – це завжди </w:t>
+      </w:r>
+      <w:r>
+        <w:rPr>
+          <w:rFonts w:ascii="Courier New" w:eastAsia="Times New Roman" w:hAnsi="Courier New" w:cs="Courier New"/>
+          <w:sz w:val="20"/>
+          <w:szCs w:val="20"/>
+          <w:lang w:eastAsia="ru-RU"/>
+        </w:rPr>
+        <w:t>https://e-plan.vercel.app</w:t>
+      </w:r>
+      <w:r>
+        <w:rPr>
+          <w:rFonts w:ascii="Times New Roman" w:eastAsia="Times New Roman" w:hAnsi="Times New Roman" w:cs="Times New Roman"/>
+          <w:sz w:val="24"/>
+          <w:szCs w:val="24"/>
+          <w:lang w:eastAsia="ru-RU"/>
+        </w:rPr>
+        <w:t>.</w:t>
+      </w:r>
+    </w:p>
+    <w:p>
+      <w:pPr>
+        <w:spacing w:after="0" w:line="240" w:lineRule="auto"/>
+        <w:rPr>
+          <w:rFonts w:ascii="Times New Roman" w:eastAsia="Times New Roman" w:hAnsi="Times New Roman" w:cs="Times New Roman"/>
+          <w:sz w:val="24"/>
+          <w:szCs w:val="24"/>
+          <w:lang w:eastAsia="ru-RU"/>
+        </w:rPr>
+      </w:pPr>
+      <w:r>
+        <w:rPr>
+          <w:rFonts w:ascii="Times New Roman" w:eastAsia="Times New Roman" w:hAnsi="Times New Roman" w:cs="Times New Roman"/>
+          <w:sz w:val="24"/>
+          <w:szCs w:val="24"/>
+          <w:lang w:eastAsia="ru-RU"/>
+        </w:rPr>
+        <w:lastRenderedPageBreak/>
+        <w:pict w14:anchorId="3F9C6624">
+          <v:rect id="_x0000_i1047" style="width:0;height:1.5pt" o:hralign="center" o:hrstd="t" o:hr="t" fillcolor="#a0a0a0" stroked="f"/>
+        </w:pict>
+      </w:r>
+    </w:p>
+    <w:p>
+      <w:pPr>
+        <w:spacing w:before="100" w:beforeAutospacing="1" w:after="100" w:afterAutospacing="1" w:line="240" w:lineRule="auto"/>
+        <w:rPr>
+          <w:rFonts w:ascii="Times New Roman" w:eastAsia="Times New Roman" w:hAnsi="Times New Roman" w:cs="Times New Roman"/>
+          <w:sz w:val="24"/>
+          <w:szCs w:val="24"/>
+          <w:lang w:eastAsia="ru-RU"/>
+        </w:rPr>
+      </w:pPr>
+      <w:r>
+        <w:rPr>
+          <w:rFonts w:ascii="Times New Roman" w:eastAsia="Times New Roman" w:hAnsi="Times New Roman" w:cs="Times New Roman"/>
+          <w:sz w:val="24"/>
+          <w:szCs w:val="24"/>
+          <w:lang w:eastAsia="ru-RU"/>
+        </w:rPr>
+        <w:t xml:space="preserve">Якщо хочеш, я можу скласти </w:t>
+      </w:r>
+      <w:r>
+        <w:rPr>
+          <w:rFonts w:ascii="Times New Roman" w:eastAsia="Times New Roman" w:hAnsi="Times New Roman" w:cs="Times New Roman"/>
+          <w:b/>
+          <w:bCs/>
+          <w:sz w:val="24"/>
+          <w:szCs w:val="24"/>
+          <w:lang w:eastAsia="ru-RU"/>
+        </w:rPr>
+        <w:t>коротку “чек-лист інструкцію для остаточного деплою”</w:t>
+      </w:r>
+      <w:r>
+        <w:rPr>
+          <w:rFonts w:ascii="Times New Roman" w:eastAsia="Times New Roman" w:hAnsi="Times New Roman" w:cs="Times New Roman"/>
+          <w:sz w:val="24"/>
+          <w:szCs w:val="24"/>
+          <w:lang w:eastAsia="ru-RU"/>
+        </w:rPr>
+        <w:t>, щоб наступного разу все робилося одним махом без плутанини з URL і alias.</w:t>
+      </w:r>
+    </w:p>
+    <w:p>
+      <w:pPr>
+        <w:spacing w:before="100" w:beforeAutospacing="1" w:after="100" w:afterAutospacing="1" w:line="240" w:lineRule="auto"/>
+        <w:rPr>
+          <w:rFonts w:ascii="Times New Roman" w:eastAsia="Times New Roman" w:hAnsi="Times New Roman" w:cs="Times New Roman"/>
+          <w:sz w:val="24"/>
+          <w:szCs w:val="24"/>
+          <w:lang w:eastAsia="ru-RU"/>
+        </w:rPr>
+      </w:pPr>
+      <w:r>
+        <w:rPr>
+          <w:rFonts w:ascii="Times New Roman" w:eastAsia="Times New Roman" w:hAnsi="Times New Roman" w:cs="Times New Roman"/>
+          <w:sz w:val="24"/>
+          <w:szCs w:val="24"/>
+          <w:lang w:eastAsia="ru-RU"/>
+        </w:rPr>
+        <w:t>Хочеш, щоб я її зробив?</w:t>
+      </w:r>
+    </w:p>
+    <w:p>
+      <w:pPr>
+        <w:spacing w:after="0" w:line="240" w:lineRule="auto"/>
+        <w:rPr>
+          <w:rFonts w:ascii="Times New Roman" w:eastAsia="Times New Roman" w:hAnsi="Times New Roman" w:cs="Times New Roman"/>
+          <w:sz w:val="24"/>
+          <w:szCs w:val="24"/>
+          <w:lang w:eastAsia="ru-RU"/>
+        </w:rPr>
+      </w:pPr>
     </w:p>
     <w:sectPr>
       <w:pgSz w:w="11906" w:h="16838"/>
@@ -4623,6 +5574,268 @@
 <file path=word/numbering.xml><?xml version="1.0" encoding="utf-8"?>
 <w:numbering xmlns:wpc="http://schemas.microsoft.com/office/word/2010/wordprocessingCanvas" xmlns:cx="http://schemas.microsoft.com/office/drawing/2014/chartex" xmlns:cx1="http://schemas.microsoft.com/office/drawing/2015/9/8/chartex" xmlns:cx2="http://schemas.microsoft.com/office/drawing/2015/10/21/chartex" xmlns:cx3="http://schemas.microsoft.com/office/drawing/2016/5/9/chartex" xmlns:cx4="http://schemas.microsoft.com/office/drawing/2016/5/10/chartex" xmlns:cx5="http://schemas.microsoft.com/office/drawing/2016/5/11/chartex" xmlns:cx6="http://schemas.microsoft.com/office/drawing/2016/5/12/chartex" xmlns:cx7="http://schemas.microsoft.com/office/drawing/2016/5/13/chartex" xmlns:cx8="http://schemas.microsoft.com/office/drawing/2016/5/14/chartex" xmlns:mc="http://schemas.openxmlformats.org/markup-compatibility/2006" xmlns:aink="http://schemas.microsoft.com/office/drawing/2016/ink" xmlns:am3d="http://schemas.microsoft.com/office/drawing/2017/model3d" xmlns:o="urn:schemas-microsoft-com:office:office" xmlns:r="http://schemas.openxmlformats.org/officeDocument/2006/relationships" xmlns:m="http://schemas.openxmlformats.org/officeDocument/2006/math" xmlns:v="urn:schemas-microsoft-com:vml" xmlns:wp14="http://schemas.microsoft.com/office/word/2010/wordprocessingDrawing" xmlns:wp="http://schemas.openxmlformats.org/drawingml/2006/wordprocessingDrawing" xmlns:w10="urn:schemas-microsoft-com:office:word" xmlns:w="http://schemas.openxmlformats.org/wordprocessingml/2006/main" xmlns:w14="http://schemas.microsoft.com/office/word/2010/wordml" xmlns:w15="http://schemas.microsoft.com/office/word/2012/wordml" xmlns:w16cex="http://schemas.microsoft.com/office/word/2018/wordml/cex" xmlns:w16cid="http://schemas.microsoft.com/office/word/2016/wordml/cid" xmlns:w16="http://schemas.microsoft.com/office/word/2018/wordml" xmlns:w16sdtdh="http://schemas.microsoft.com/office/word/2020/wordml/sdtdatahash" xmlns:w16se="http://schemas.microsoft.com/office/word/2015/wordml/symex" xmlns:wpg="http://schemas.microsoft.com/office/word/2010/wordprocessingGroup" xmlns:wpi="http://schemas.microsoft.com/office/word/2010/wordprocessingInk" xmlns:wne="http://schemas.microsoft.com/office/word/2006/wordml" xmlns:wps="http://schemas.microsoft.com/office/word/2010/wordprocessingShape" mc:Ignorable="w14 w15 w16se w16cid w16 w16cex w16sdtdh wp14">
   <w:abstractNum w:abstractNumId="0" w15:restartNumberingAfterBreak="0">
+    <w:nsid w:val="071B52AD"/>
+    <w:multiLevelType w:val="multilevel"/>
+    <w:tmpl w:val="14EA9CDE"/>
+    <w:lvl w:ilvl="0">
+      <w:start w:val="1"/>
+      <w:numFmt w:val="bullet"/>
+      <w:lvlText w:val=""/>
+      <w:lvlJc w:val="left"/>
+      <w:pPr>
+        <w:tabs>
+          <w:tab w:val="num" w:pos="720"/>
+        </w:tabs>
+        <w:ind w:left="720" w:hanging="360"/>
+      </w:pPr>
+      <w:rPr>
+        <w:rFonts w:ascii="Symbol" w:hAnsi="Symbol" w:hint="default"/>
+        <w:sz w:val="20"/>
+      </w:rPr>
+    </w:lvl>
+    <w:lvl w:ilvl="1" w:tentative="1">
+      <w:start w:val="1"/>
+      <w:numFmt w:val="bullet"/>
+      <w:lvlText w:val="o"/>
+      <w:lvlJc w:val="left"/>
+      <w:pPr>
+        <w:tabs>
+          <w:tab w:val="num" w:pos="1440"/>
+        </w:tabs>
+        <w:ind w:left="1440" w:hanging="360"/>
+      </w:pPr>
+      <w:rPr>
+        <w:rFonts w:ascii="Courier New" w:hAnsi="Courier New" w:hint="default"/>
+        <w:sz w:val="20"/>
+      </w:rPr>
+    </w:lvl>
+    <w:lvl w:ilvl="2" w:tentative="1">
+      <w:start w:val="1"/>
+      <w:numFmt w:val="bullet"/>
+      <w:lvlText w:val=""/>
+      <w:lvlJc w:val="left"/>
+      <w:pPr>
+        <w:tabs>
+          <w:tab w:val="num" w:pos="2160"/>
+        </w:tabs>
+        <w:ind w:left="2160" w:hanging="360"/>
+      </w:pPr>
+      <w:rPr>
+        <w:rFonts w:ascii="Wingdings" w:hAnsi="Wingdings" w:hint="default"/>
+        <w:sz w:val="20"/>
+      </w:rPr>
+    </w:lvl>
+    <w:lvl w:ilvl="3" w:tentative="1">
+      <w:start w:val="1"/>
+      <w:numFmt w:val="bullet"/>
+      <w:lvlText w:val=""/>
+      <w:lvlJc w:val="left"/>
+      <w:pPr>
+        <w:tabs>
+          <w:tab w:val="num" w:pos="2880"/>
+        </w:tabs>
+        <w:ind w:left="2880" w:hanging="360"/>
+      </w:pPr>
+      <w:rPr>
+        <w:rFonts w:ascii="Wingdings" w:hAnsi="Wingdings" w:hint="default"/>
+        <w:sz w:val="20"/>
+      </w:rPr>
+    </w:lvl>
+    <w:lvl w:ilvl="4" w:tentative="1">
+      <w:start w:val="1"/>
+      <w:numFmt w:val="bullet"/>
+      <w:lvlText w:val=""/>
+      <w:lvlJc w:val="left"/>
+      <w:pPr>
+        <w:tabs>
+          <w:tab w:val="num" w:pos="3600"/>
+        </w:tabs>
+        <w:ind w:left="3600" w:hanging="360"/>
+      </w:pPr>
+      <w:rPr>
+        <w:rFonts w:ascii="Wingdings" w:hAnsi="Wingdings" w:hint="default"/>
+        <w:sz w:val="20"/>
+      </w:rPr>
+    </w:lvl>
+    <w:lvl w:ilvl="5" w:tentative="1">
+      <w:start w:val="1"/>
+      <w:numFmt w:val="bullet"/>
+      <w:lvlText w:val=""/>
+      <w:lvlJc w:val="left"/>
+      <w:pPr>
+        <w:tabs>
+          <w:tab w:val="num" w:pos="4320"/>
+        </w:tabs>
+        <w:ind w:left="4320" w:hanging="360"/>
+      </w:pPr>
+      <w:rPr>
+        <w:rFonts w:ascii="Wingdings" w:hAnsi="Wingdings" w:hint="default"/>
+        <w:sz w:val="20"/>
+      </w:rPr>
+    </w:lvl>
+    <w:lvl w:ilvl="6" w:tentative="1">
+      <w:start w:val="1"/>
+      <w:numFmt w:val="bullet"/>
+      <w:lvlText w:val=""/>
+      <w:lvlJc w:val="left"/>
+      <w:pPr>
+        <w:tabs>
+          <w:tab w:val="num" w:pos="5040"/>
+        </w:tabs>
+        <w:ind w:left="5040" w:hanging="360"/>
+      </w:pPr>
+      <w:rPr>
+        <w:rFonts w:ascii="Wingdings" w:hAnsi="Wingdings" w:hint="default"/>
+        <w:sz w:val="20"/>
+      </w:rPr>
+    </w:lvl>
+    <w:lvl w:ilvl="7" w:tentative="1">
+      <w:start w:val="1"/>
+      <w:numFmt w:val="bullet"/>
+      <w:lvlText w:val=""/>
+      <w:lvlJc w:val="left"/>
+      <w:pPr>
+        <w:tabs>
+          <w:tab w:val="num" w:pos="5760"/>
+        </w:tabs>
+        <w:ind w:left="5760" w:hanging="360"/>
+      </w:pPr>
+      <w:rPr>
+        <w:rFonts w:ascii="Wingdings" w:hAnsi="Wingdings" w:hint="default"/>
+        <w:sz w:val="20"/>
+      </w:rPr>
+    </w:lvl>
+    <w:lvl w:ilvl="8" w:tentative="1">
+      <w:start w:val="1"/>
+      <w:numFmt w:val="bullet"/>
+      <w:lvlText w:val=""/>
+      <w:lvlJc w:val="left"/>
+      <w:pPr>
+        <w:tabs>
+          <w:tab w:val="num" w:pos="6480"/>
+        </w:tabs>
+        <w:ind w:left="6480" w:hanging="360"/>
+      </w:pPr>
+      <w:rPr>
+        <w:rFonts w:ascii="Wingdings" w:hAnsi="Wingdings" w:hint="default"/>
+        <w:sz w:val="20"/>
+      </w:rPr>
+    </w:lvl>
+  </w:abstractNum>
+  <w:abstractNum w:abstractNumId="1" w15:restartNumberingAfterBreak="0">
+    <w:nsid w:val="0F38017E"/>
+    <w:multiLevelType w:val="multilevel"/>
+    <w:tmpl w:val="D7B020AC"/>
+    <w:lvl w:ilvl="0">
+      <w:start w:val="1"/>
+      <w:numFmt w:val="decimal"/>
+      <w:lvlText w:val="%1."/>
+      <w:lvlJc w:val="left"/>
+      <w:pPr>
+        <w:tabs>
+          <w:tab w:val="num" w:pos="720"/>
+        </w:tabs>
+        <w:ind w:left="720" w:hanging="360"/>
+      </w:pPr>
+    </w:lvl>
+    <w:lvl w:ilvl="1" w:tentative="1">
+      <w:start w:val="1"/>
+      <w:numFmt w:val="decimal"/>
+      <w:lvlText w:val="%2."/>
+      <w:lvlJc w:val="left"/>
+      <w:pPr>
+        <w:tabs>
+          <w:tab w:val="num" w:pos="1440"/>
+        </w:tabs>
+        <w:ind w:left="1440" w:hanging="360"/>
+      </w:pPr>
+    </w:lvl>
+    <w:lvl w:ilvl="2" w:tentative="1">
+      <w:start w:val="1"/>
+      <w:numFmt w:val="decimal"/>
+      <w:lvlText w:val="%3."/>
+      <w:lvlJc w:val="left"/>
+      <w:pPr>
+        <w:tabs>
+          <w:tab w:val="num" w:pos="2160"/>
+        </w:tabs>
+        <w:ind w:left="2160" w:hanging="360"/>
+      </w:pPr>
+    </w:lvl>
+    <w:lvl w:ilvl="3" w:tentative="1">
+      <w:start w:val="1"/>
+      <w:numFmt w:val="decimal"/>
+      <w:lvlText w:val="%4."/>
+      <w:lvlJc w:val="left"/>
+      <w:pPr>
+        <w:tabs>
+          <w:tab w:val="num" w:pos="2880"/>
+        </w:tabs>
+        <w:ind w:left="2880" w:hanging="360"/>
+      </w:pPr>
+    </w:lvl>
+    <w:lvl w:ilvl="4" w:tentative="1">
+      <w:start w:val="1"/>
+      <w:numFmt w:val="decimal"/>
+      <w:lvlText w:val="%5."/>
+      <w:lvlJc w:val="left"/>
+      <w:pPr>
+        <w:tabs>
+          <w:tab w:val="num" w:pos="3600"/>
+        </w:tabs>
+        <w:ind w:left="3600" w:hanging="360"/>
+      </w:pPr>
+    </w:lvl>
+    <w:lvl w:ilvl="5" w:tentative="1">
+      <w:start w:val="1"/>
+      <w:numFmt w:val="decimal"/>
+      <w:lvlText w:val="%6."/>
+      <w:lvlJc w:val="left"/>
+      <w:pPr>
+        <w:tabs>
+          <w:tab w:val="num" w:pos="4320"/>
+        </w:tabs>
+        <w:ind w:left="4320" w:hanging="360"/>
+      </w:pPr>
+    </w:lvl>
+    <w:lvl w:ilvl="6" w:tentative="1">
+      <w:start w:val="1"/>
+      <w:numFmt w:val="decimal"/>
+      <w:lvlText w:val="%7."/>
+      <w:lvlJc w:val="left"/>
+      <w:pPr>
+        <w:tabs>
+          <w:tab w:val="num" w:pos="5040"/>
+        </w:tabs>
+        <w:ind w:left="5040" w:hanging="360"/>
+      </w:pPr>
+    </w:lvl>
+    <w:lvl w:ilvl="7" w:tentative="1">
+      <w:start w:val="1"/>
+      <w:numFmt w:val="decimal"/>
+      <w:lvlText w:val="%8."/>
+      <w:lvlJc w:val="left"/>
+      <w:pPr>
+        <w:tabs>
+          <w:tab w:val="num" w:pos="5760"/>
+        </w:tabs>
+        <w:ind w:left="5760" w:hanging="360"/>
+      </w:pPr>
+    </w:lvl>
+    <w:lvl w:ilvl="8" w:tentative="1">
+      <w:start w:val="1"/>
+      <w:numFmt w:val="decimal"/>
+      <w:lvlText w:val="%9."/>
+      <w:lvlJc w:val="left"/>
+      <w:pPr>
+        <w:tabs>
+          <w:tab w:val="num" w:pos="6480"/>
+        </w:tabs>
+        <w:ind w:left="6480" w:hanging="360"/>
+      </w:pPr>
+    </w:lvl>
+  </w:abstractNum>
+  <w:abstractNum w:abstractNumId="2" w15:restartNumberingAfterBreak="0">
     <w:nsid w:val="105946A6"/>
     <w:multiLevelType w:val="multilevel"/>
     <w:tmpl w:val="099AAAC4"/>
@@ -4739,7 +5952,269 @@
       </w:pPr>
     </w:lvl>
   </w:abstractNum>
-  <w:abstractNum w:abstractNumId="1" w15:restartNumberingAfterBreak="0">
+  <w:abstractNum w:abstractNumId="3" w15:restartNumberingAfterBreak="0">
+    <w:nsid w:val="14233474"/>
+    <w:multiLevelType w:val="multilevel"/>
+    <w:tmpl w:val="2A14C030"/>
+    <w:lvl w:ilvl="0">
+      <w:start w:val="1"/>
+      <w:numFmt w:val="bullet"/>
+      <w:lvlText w:val=""/>
+      <w:lvlJc w:val="left"/>
+      <w:pPr>
+        <w:tabs>
+          <w:tab w:val="num" w:pos="720"/>
+        </w:tabs>
+        <w:ind w:left="720" w:hanging="360"/>
+      </w:pPr>
+      <w:rPr>
+        <w:rFonts w:ascii="Symbol" w:hAnsi="Symbol" w:hint="default"/>
+        <w:sz w:val="20"/>
+      </w:rPr>
+    </w:lvl>
+    <w:lvl w:ilvl="1" w:tentative="1">
+      <w:start w:val="1"/>
+      <w:numFmt w:val="bullet"/>
+      <w:lvlText w:val="o"/>
+      <w:lvlJc w:val="left"/>
+      <w:pPr>
+        <w:tabs>
+          <w:tab w:val="num" w:pos="1440"/>
+        </w:tabs>
+        <w:ind w:left="1440" w:hanging="360"/>
+      </w:pPr>
+      <w:rPr>
+        <w:rFonts w:ascii="Courier New" w:hAnsi="Courier New" w:hint="default"/>
+        <w:sz w:val="20"/>
+      </w:rPr>
+    </w:lvl>
+    <w:lvl w:ilvl="2" w:tentative="1">
+      <w:start w:val="1"/>
+      <w:numFmt w:val="bullet"/>
+      <w:lvlText w:val=""/>
+      <w:lvlJc w:val="left"/>
+      <w:pPr>
+        <w:tabs>
+          <w:tab w:val="num" w:pos="2160"/>
+        </w:tabs>
+        <w:ind w:left="2160" w:hanging="360"/>
+      </w:pPr>
+      <w:rPr>
+        <w:rFonts w:ascii="Wingdings" w:hAnsi="Wingdings" w:hint="default"/>
+        <w:sz w:val="20"/>
+      </w:rPr>
+    </w:lvl>
+    <w:lvl w:ilvl="3" w:tentative="1">
+      <w:start w:val="1"/>
+      <w:numFmt w:val="bullet"/>
+      <w:lvlText w:val=""/>
+      <w:lvlJc w:val="left"/>
+      <w:pPr>
+        <w:tabs>
+          <w:tab w:val="num" w:pos="2880"/>
+        </w:tabs>
+        <w:ind w:left="2880" w:hanging="360"/>
+      </w:pPr>
+      <w:rPr>
+        <w:rFonts w:ascii="Wingdings" w:hAnsi="Wingdings" w:hint="default"/>
+        <w:sz w:val="20"/>
+      </w:rPr>
+    </w:lvl>
+    <w:lvl w:ilvl="4" w:tentative="1">
+      <w:start w:val="1"/>
+      <w:numFmt w:val="bullet"/>
+      <w:lvlText w:val=""/>
+      <w:lvlJc w:val="left"/>
+      <w:pPr>
+        <w:tabs>
+          <w:tab w:val="num" w:pos="3600"/>
+        </w:tabs>
+        <w:ind w:left="3600" w:hanging="360"/>
+      </w:pPr>
+      <w:rPr>
+        <w:rFonts w:ascii="Wingdings" w:hAnsi="Wingdings" w:hint="default"/>
+        <w:sz w:val="20"/>
+      </w:rPr>
+    </w:lvl>
+    <w:lvl w:ilvl="5" w:tentative="1">
+      <w:start w:val="1"/>
+      <w:numFmt w:val="bullet"/>
+      <w:lvlText w:val=""/>
+      <w:lvlJc w:val="left"/>
+      <w:pPr>
+        <w:tabs>
+          <w:tab w:val="num" w:pos="4320"/>
+        </w:tabs>
+        <w:ind w:left="4320" w:hanging="360"/>
+      </w:pPr>
+      <w:rPr>
+        <w:rFonts w:ascii="Wingdings" w:hAnsi="Wingdings" w:hint="default"/>
+        <w:sz w:val="20"/>
+      </w:rPr>
+    </w:lvl>
+    <w:lvl w:ilvl="6" w:tentative="1">
+      <w:start w:val="1"/>
+      <w:numFmt w:val="bullet"/>
+      <w:lvlText w:val=""/>
+      <w:lvlJc w:val="left"/>
+      <w:pPr>
+        <w:tabs>
+          <w:tab w:val="num" w:pos="5040"/>
+        </w:tabs>
+        <w:ind w:left="5040" w:hanging="360"/>
+      </w:pPr>
+      <w:rPr>
+        <w:rFonts w:ascii="Wingdings" w:hAnsi="Wingdings" w:hint="default"/>
+        <w:sz w:val="20"/>
+      </w:rPr>
+    </w:lvl>
+    <w:lvl w:ilvl="7" w:tentative="1">
+      <w:start w:val="1"/>
+      <w:numFmt w:val="bullet"/>
+      <w:lvlText w:val=""/>
+      <w:lvlJc w:val="left"/>
+      <w:pPr>
+        <w:tabs>
+          <w:tab w:val="num" w:pos="5760"/>
+        </w:tabs>
+        <w:ind w:left="5760" w:hanging="360"/>
+      </w:pPr>
+      <w:rPr>
+        <w:rFonts w:ascii="Wingdings" w:hAnsi="Wingdings" w:hint="default"/>
+        <w:sz w:val="20"/>
+      </w:rPr>
+    </w:lvl>
+    <w:lvl w:ilvl="8" w:tentative="1">
+      <w:start w:val="1"/>
+      <w:numFmt w:val="bullet"/>
+      <w:lvlText w:val=""/>
+      <w:lvlJc w:val="left"/>
+      <w:pPr>
+        <w:tabs>
+          <w:tab w:val="num" w:pos="6480"/>
+        </w:tabs>
+        <w:ind w:left="6480" w:hanging="360"/>
+      </w:pPr>
+      <w:rPr>
+        <w:rFonts w:ascii="Wingdings" w:hAnsi="Wingdings" w:hint="default"/>
+        <w:sz w:val="20"/>
+      </w:rPr>
+    </w:lvl>
+  </w:abstractNum>
+  <w:abstractNum w:abstractNumId="4" w15:restartNumberingAfterBreak="0">
+    <w:nsid w:val="148D12ED"/>
+    <w:multiLevelType w:val="multilevel"/>
+    <w:tmpl w:val="61F6BA8C"/>
+    <w:lvl w:ilvl="0">
+      <w:start w:val="2"/>
+      <w:numFmt w:val="decimal"/>
+      <w:lvlText w:val="%1."/>
+      <w:lvlJc w:val="left"/>
+      <w:pPr>
+        <w:tabs>
+          <w:tab w:val="num" w:pos="720"/>
+        </w:tabs>
+        <w:ind w:left="720" w:hanging="360"/>
+      </w:pPr>
+    </w:lvl>
+    <w:lvl w:ilvl="1" w:tentative="1">
+      <w:start w:val="1"/>
+      <w:numFmt w:val="decimal"/>
+      <w:lvlText w:val="%2."/>
+      <w:lvlJc w:val="left"/>
+      <w:pPr>
+        <w:tabs>
+          <w:tab w:val="num" w:pos="1440"/>
+        </w:tabs>
+        <w:ind w:left="1440" w:hanging="360"/>
+      </w:pPr>
+    </w:lvl>
+    <w:lvl w:ilvl="2" w:tentative="1">
+      <w:start w:val="1"/>
+      <w:numFmt w:val="decimal"/>
+      <w:lvlText w:val="%3."/>
+      <w:lvlJc w:val="left"/>
+      <w:pPr>
+        <w:tabs>
+          <w:tab w:val="num" w:pos="2160"/>
+        </w:tabs>
+        <w:ind w:left="2160" w:hanging="360"/>
+      </w:pPr>
+    </w:lvl>
+    <w:lvl w:ilvl="3" w:tentative="1">
+      <w:start w:val="1"/>
+      <w:numFmt w:val="decimal"/>
+      <w:lvlText w:val="%4."/>
+      <w:lvlJc w:val="left"/>
+      <w:pPr>
+        <w:tabs>
+          <w:tab w:val="num" w:pos="2880"/>
+        </w:tabs>
+        <w:ind w:left="2880" w:hanging="360"/>
+      </w:pPr>
+    </w:lvl>
+    <w:lvl w:ilvl="4" w:tentative="1">
+      <w:start w:val="1"/>
+      <w:numFmt w:val="decimal"/>
+      <w:lvlText w:val="%5."/>
+      <w:lvlJc w:val="left"/>
+      <w:pPr>
+        <w:tabs>
+          <w:tab w:val="num" w:pos="3600"/>
+        </w:tabs>
+        <w:ind w:left="3600" w:hanging="360"/>
+      </w:pPr>
+    </w:lvl>
+    <w:lvl w:ilvl="5" w:tentative="1">
+      <w:start w:val="1"/>
+      <w:numFmt w:val="decimal"/>
+      <w:lvlText w:val="%6."/>
+      <w:lvlJc w:val="left"/>
+      <w:pPr>
+        <w:tabs>
+          <w:tab w:val="num" w:pos="4320"/>
+        </w:tabs>
+        <w:ind w:left="4320" w:hanging="360"/>
+      </w:pPr>
+    </w:lvl>
+    <w:lvl w:ilvl="6" w:tentative="1">
+      <w:start w:val="1"/>
+      <w:numFmt w:val="decimal"/>
+      <w:lvlText w:val="%7."/>
+      <w:lvlJc w:val="left"/>
+      <w:pPr>
+        <w:tabs>
+          <w:tab w:val="num" w:pos="5040"/>
+        </w:tabs>
+        <w:ind w:left="5040" w:hanging="360"/>
+      </w:pPr>
+    </w:lvl>
+    <w:lvl w:ilvl="7" w:tentative="1">
+      <w:start w:val="1"/>
+      <w:numFmt w:val="decimal"/>
+      <w:lvlText w:val="%8."/>
+      <w:lvlJc w:val="left"/>
+      <w:pPr>
+        <w:tabs>
+          <w:tab w:val="num" w:pos="5760"/>
+        </w:tabs>
+        <w:ind w:left="5760" w:hanging="360"/>
+      </w:pPr>
+    </w:lvl>
+    <w:lvl w:ilvl="8" w:tentative="1">
+      <w:start w:val="1"/>
+      <w:numFmt w:val="decimal"/>
+      <w:lvlText w:val="%9."/>
+      <w:lvlJc w:val="left"/>
+      <w:pPr>
+        <w:tabs>
+          <w:tab w:val="num" w:pos="6480"/>
+        </w:tabs>
+        <w:ind w:left="6480" w:hanging="360"/>
+      </w:pPr>
+    </w:lvl>
+  </w:abstractNum>
+  <w:abstractNum w:abstractNumId="5" w15:restartNumberingAfterBreak="0">
     <w:nsid w:val="154E1029"/>
     <w:multiLevelType w:val="multilevel"/>
     <w:tmpl w:val="404E6726"/>
@@ -4888,7 +6363,7 @@
       </w:rPr>
     </w:lvl>
   </w:abstractNum>
-  <w:abstractNum w:abstractNumId="2" w15:restartNumberingAfterBreak="0">
+  <w:abstractNum w:abstractNumId="6" w15:restartNumberingAfterBreak="0">
     <w:nsid w:val="23DB477A"/>
     <w:multiLevelType w:val="multilevel"/>
     <w:tmpl w:val="95A093E8"/>
@@ -5005,7 +6480,305 @@
       </w:pPr>
     </w:lvl>
   </w:abstractNum>
-  <w:abstractNum w:abstractNumId="3" w15:restartNumberingAfterBreak="0">
+  <w:abstractNum w:abstractNumId="7" w15:restartNumberingAfterBreak="0">
+    <w:nsid w:val="30C77179"/>
+    <w:multiLevelType w:val="multilevel"/>
+    <w:tmpl w:val="10B2CFDA"/>
+    <w:lvl w:ilvl="0">
+      <w:start w:val="1"/>
+      <w:numFmt w:val="bullet"/>
+      <w:lvlText w:val=""/>
+      <w:lvlJc w:val="left"/>
+      <w:pPr>
+        <w:tabs>
+          <w:tab w:val="num" w:pos="720"/>
+        </w:tabs>
+        <w:ind w:left="720" w:hanging="360"/>
+      </w:pPr>
+      <w:rPr>
+        <w:rFonts w:ascii="Symbol" w:hAnsi="Symbol" w:hint="default"/>
+        <w:sz w:val="20"/>
+      </w:rPr>
+    </w:lvl>
+    <w:lvl w:ilvl="1" w:tentative="1">
+      <w:start w:val="1"/>
+      <w:numFmt w:val="bullet"/>
+      <w:lvlText w:val="o"/>
+      <w:lvlJc w:val="left"/>
+      <w:pPr>
+        <w:tabs>
+          <w:tab w:val="num" w:pos="1440"/>
+        </w:tabs>
+        <w:ind w:left="1440" w:hanging="360"/>
+      </w:pPr>
+      <w:rPr>
+        <w:rFonts w:ascii="Courier New" w:hAnsi="Courier New" w:hint="default"/>
+        <w:sz w:val="20"/>
+      </w:rPr>
+    </w:lvl>
+    <w:lvl w:ilvl="2" w:tentative="1">
+      <w:start w:val="1"/>
+      <w:numFmt w:val="bullet"/>
+      <w:lvlText w:val=""/>
+      <w:lvlJc w:val="left"/>
+      <w:pPr>
+        <w:tabs>
+          <w:tab w:val="num" w:pos="2160"/>
+        </w:tabs>
+        <w:ind w:left="2160" w:hanging="360"/>
+      </w:pPr>
+      <w:rPr>
+        <w:rFonts w:ascii="Wingdings" w:hAnsi="Wingdings" w:hint="default"/>
+        <w:sz w:val="20"/>
+      </w:rPr>
+    </w:lvl>
+    <w:lvl w:ilvl="3" w:tentative="1">
+      <w:start w:val="1"/>
+      <w:numFmt w:val="bullet"/>
+      <w:lvlText w:val=""/>
+      <w:lvlJc w:val="left"/>
+      <w:pPr>
+        <w:tabs>
+          <w:tab w:val="num" w:pos="2880"/>
+        </w:tabs>
+        <w:ind w:left="2880" w:hanging="360"/>
+      </w:pPr>
+      <w:rPr>
+        <w:rFonts w:ascii="Wingdings" w:hAnsi="Wingdings" w:hint="default"/>
+        <w:sz w:val="20"/>
+      </w:rPr>
+    </w:lvl>
+    <w:lvl w:ilvl="4" w:tentative="1">
+      <w:start w:val="1"/>
+      <w:numFmt w:val="bullet"/>
+      <w:lvlText w:val=""/>
+      <w:lvlJc w:val="left"/>
+      <w:pPr>
+        <w:tabs>
+          <w:tab w:val="num" w:pos="3600"/>
+        </w:tabs>
+        <w:ind w:left="3600" w:hanging="360"/>
+      </w:pPr>
+      <w:rPr>
+        <w:rFonts w:ascii="Wingdings" w:hAnsi="Wingdings" w:hint="default"/>
+        <w:sz w:val="20"/>
+      </w:rPr>
+    </w:lvl>
+    <w:lvl w:ilvl="5" w:tentative="1">
+      <w:start w:val="1"/>
+      <w:numFmt w:val="bullet"/>
+      <w:lvlText w:val=""/>
+      <w:lvlJc w:val="left"/>
+      <w:pPr>
+        <w:tabs>
+          <w:tab w:val="num" w:pos="4320"/>
+        </w:tabs>
+        <w:ind w:left="4320" w:hanging="360"/>
+      </w:pPr>
+      <w:rPr>
+        <w:rFonts w:ascii="Wingdings" w:hAnsi="Wingdings" w:hint="default"/>
+        <w:sz w:val="20"/>
+      </w:rPr>
+    </w:lvl>
+    <w:lvl w:ilvl="6" w:tentative="1">
+      <w:start w:val="1"/>
+      <w:numFmt w:val="bullet"/>
+      <w:lvlText w:val=""/>
+      <w:lvlJc w:val="left"/>
+      <w:pPr>
+        <w:tabs>
+          <w:tab w:val="num" w:pos="5040"/>
+        </w:tabs>
+        <w:ind w:left="5040" w:hanging="360"/>
+      </w:pPr>
+      <w:rPr>
+        <w:rFonts w:ascii="Wingdings" w:hAnsi="Wingdings" w:hint="default"/>
+        <w:sz w:val="20"/>
+      </w:rPr>
+    </w:lvl>
+    <w:lvl w:ilvl="7" w:tentative="1">
+      <w:start w:val="1"/>
+      <w:numFmt w:val="bullet"/>
+      <w:lvlText w:val=""/>
+      <w:lvlJc w:val="left"/>
+      <w:pPr>
+        <w:tabs>
+          <w:tab w:val="num" w:pos="5760"/>
+        </w:tabs>
+        <w:ind w:left="5760" w:hanging="360"/>
+      </w:pPr>
+      <w:rPr>
+        <w:rFonts w:ascii="Wingdings" w:hAnsi="Wingdings" w:hint="default"/>
+        <w:sz w:val="20"/>
+      </w:rPr>
+    </w:lvl>
+    <w:lvl w:ilvl="8" w:tentative="1">
+      <w:start w:val="1"/>
+      <w:numFmt w:val="bullet"/>
+      <w:lvlText w:val=""/>
+      <w:lvlJc w:val="left"/>
+      <w:pPr>
+        <w:tabs>
+          <w:tab w:val="num" w:pos="6480"/>
+        </w:tabs>
+        <w:ind w:left="6480" w:hanging="360"/>
+      </w:pPr>
+      <w:rPr>
+        <w:rFonts w:ascii="Wingdings" w:hAnsi="Wingdings" w:hint="default"/>
+        <w:sz w:val="20"/>
+      </w:rPr>
+    </w:lvl>
+  </w:abstractNum>
+  <w:abstractNum w:abstractNumId="8" w15:restartNumberingAfterBreak="0">
+    <w:nsid w:val="364D5E4A"/>
+    <w:multiLevelType w:val="multilevel"/>
+    <w:tmpl w:val="29505FC8"/>
+    <w:lvl w:ilvl="0">
+      <w:start w:val="1"/>
+      <w:numFmt w:val="bullet"/>
+      <w:lvlText w:val=""/>
+      <w:lvlJc w:val="left"/>
+      <w:pPr>
+        <w:tabs>
+          <w:tab w:val="num" w:pos="720"/>
+        </w:tabs>
+        <w:ind w:left="720" w:hanging="360"/>
+      </w:pPr>
+      <w:rPr>
+        <w:rFonts w:ascii="Symbol" w:hAnsi="Symbol" w:hint="default"/>
+        <w:sz w:val="20"/>
+      </w:rPr>
+    </w:lvl>
+    <w:lvl w:ilvl="1" w:tentative="1">
+      <w:start w:val="1"/>
+      <w:numFmt w:val="bullet"/>
+      <w:lvlText w:val="o"/>
+      <w:lvlJc w:val="left"/>
+      <w:pPr>
+        <w:tabs>
+          <w:tab w:val="num" w:pos="1440"/>
+        </w:tabs>
+        <w:ind w:left="1440" w:hanging="360"/>
+      </w:pPr>
+      <w:rPr>
+        <w:rFonts w:ascii="Courier New" w:hAnsi="Courier New" w:hint="default"/>
+        <w:sz w:val="20"/>
+      </w:rPr>
+    </w:lvl>
+    <w:lvl w:ilvl="2" w:tentative="1">
+      <w:start w:val="1"/>
+      <w:numFmt w:val="bullet"/>
+      <w:lvlText w:val=""/>
+      <w:lvlJc w:val="left"/>
+      <w:pPr>
+        <w:tabs>
+          <w:tab w:val="num" w:pos="2160"/>
+        </w:tabs>
+        <w:ind w:left="2160" w:hanging="360"/>
+      </w:pPr>
+      <w:rPr>
+        <w:rFonts w:ascii="Wingdings" w:hAnsi="Wingdings" w:hint="default"/>
+        <w:sz w:val="20"/>
+      </w:rPr>
+    </w:lvl>
+    <w:lvl w:ilvl="3" w:tentative="1">
+      <w:start w:val="1"/>
+      <w:numFmt w:val="bullet"/>
+      <w:lvlText w:val=""/>
+      <w:lvlJc w:val="left"/>
+      <w:pPr>
+        <w:tabs>
+          <w:tab w:val="num" w:pos="2880"/>
+        </w:tabs>
+        <w:ind w:left="2880" w:hanging="360"/>
+      </w:pPr>
+      <w:rPr>
+        <w:rFonts w:ascii="Wingdings" w:hAnsi="Wingdings" w:hint="default"/>
+        <w:sz w:val="20"/>
+      </w:rPr>
+    </w:lvl>
+    <w:lvl w:ilvl="4" w:tentative="1">
+      <w:start w:val="1"/>
+      <w:numFmt w:val="bullet"/>
+      <w:lvlText w:val=""/>
+      <w:lvlJc w:val="left"/>
+      <w:pPr>
+        <w:tabs>
+          <w:tab w:val="num" w:pos="3600"/>
+        </w:tabs>
+        <w:ind w:left="3600" w:hanging="360"/>
+      </w:pPr>
+      <w:rPr>
+        <w:rFonts w:ascii="Wingdings" w:hAnsi="Wingdings" w:hint="default"/>
+        <w:sz w:val="20"/>
+      </w:rPr>
+    </w:lvl>
+    <w:lvl w:ilvl="5" w:tentative="1">
+      <w:start w:val="1"/>
+      <w:numFmt w:val="bullet"/>
+      <w:lvlText w:val=""/>
+      <w:lvlJc w:val="left"/>
+      <w:pPr>
+        <w:tabs>
+          <w:tab w:val="num" w:pos="4320"/>
+        </w:tabs>
+        <w:ind w:left="4320" w:hanging="360"/>
+      </w:pPr>
+      <w:rPr>
+        <w:rFonts w:ascii="Wingdings" w:hAnsi="Wingdings" w:hint="default"/>
+        <w:sz w:val="20"/>
+      </w:rPr>
+    </w:lvl>
+    <w:lvl w:ilvl="6" w:tentative="1">
+      <w:start w:val="1"/>
+      <w:numFmt w:val="bullet"/>
+      <w:lvlText w:val=""/>
+      <w:lvlJc w:val="left"/>
+      <w:pPr>
+        <w:tabs>
+          <w:tab w:val="num" w:pos="5040"/>
+        </w:tabs>
+        <w:ind w:left="5040" w:hanging="360"/>
+      </w:pPr>
+      <w:rPr>
+        <w:rFonts w:ascii="Wingdings" w:hAnsi="Wingdings" w:hint="default"/>
+        <w:sz w:val="20"/>
+      </w:rPr>
+    </w:lvl>
+    <w:lvl w:ilvl="7" w:tentative="1">
+      <w:start w:val="1"/>
+      <w:numFmt w:val="bullet"/>
+      <w:lvlText w:val=""/>
+      <w:lvlJc w:val="left"/>
+      <w:pPr>
+        <w:tabs>
+          <w:tab w:val="num" w:pos="5760"/>
+        </w:tabs>
+        <w:ind w:left="5760" w:hanging="360"/>
+      </w:pPr>
+      <w:rPr>
+        <w:rFonts w:ascii="Wingdings" w:hAnsi="Wingdings" w:hint="default"/>
+        <w:sz w:val="20"/>
+      </w:rPr>
+    </w:lvl>
+    <w:lvl w:ilvl="8" w:tentative="1">
+      <w:start w:val="1"/>
+      <w:numFmt w:val="bullet"/>
+      <w:lvlText w:val=""/>
+      <w:lvlJc w:val="left"/>
+      <w:pPr>
+        <w:tabs>
+          <w:tab w:val="num" w:pos="6480"/>
+        </w:tabs>
+        <w:ind w:left="6480" w:hanging="360"/>
+      </w:pPr>
+      <w:rPr>
+        <w:rFonts w:ascii="Wingdings" w:hAnsi="Wingdings" w:hint="default"/>
+        <w:sz w:val="20"/>
+      </w:rPr>
+    </w:lvl>
+  </w:abstractNum>
+  <w:abstractNum w:abstractNumId="9" w15:restartNumberingAfterBreak="0">
     <w:nsid w:val="370F6953"/>
     <w:multiLevelType w:val="multilevel"/>
     <w:tmpl w:val="BAACE744"/>
@@ -5118,7 +6891,7 @@
       </w:pPr>
     </w:lvl>
   </w:abstractNum>
-  <w:abstractNum w:abstractNumId="4" w15:restartNumberingAfterBreak="0">
+  <w:abstractNum w:abstractNumId="10" w15:restartNumberingAfterBreak="0">
     <w:nsid w:val="3BA74282"/>
     <w:multiLevelType w:val="multilevel"/>
     <w:tmpl w:val="81B0C104"/>
@@ -5267,7 +7040,269 @@
       </w:rPr>
     </w:lvl>
   </w:abstractNum>
-  <w:abstractNum w:abstractNumId="5" w15:restartNumberingAfterBreak="0">
+  <w:abstractNum w:abstractNumId="11" w15:restartNumberingAfterBreak="0">
+    <w:nsid w:val="4595325C"/>
+    <w:multiLevelType w:val="multilevel"/>
+    <w:tmpl w:val="79E026D6"/>
+    <w:lvl w:ilvl="0">
+      <w:start w:val="1"/>
+      <w:numFmt w:val="bullet"/>
+      <w:lvlText w:val=""/>
+      <w:lvlJc w:val="left"/>
+      <w:pPr>
+        <w:tabs>
+          <w:tab w:val="num" w:pos="720"/>
+        </w:tabs>
+        <w:ind w:left="720" w:hanging="360"/>
+      </w:pPr>
+      <w:rPr>
+        <w:rFonts w:ascii="Symbol" w:hAnsi="Symbol" w:hint="default"/>
+        <w:sz w:val="20"/>
+      </w:rPr>
+    </w:lvl>
+    <w:lvl w:ilvl="1" w:tentative="1">
+      <w:start w:val="1"/>
+      <w:numFmt w:val="bullet"/>
+      <w:lvlText w:val="o"/>
+      <w:lvlJc w:val="left"/>
+      <w:pPr>
+        <w:tabs>
+          <w:tab w:val="num" w:pos="1440"/>
+        </w:tabs>
+        <w:ind w:left="1440" w:hanging="360"/>
+      </w:pPr>
+      <w:rPr>
+        <w:rFonts w:ascii="Courier New" w:hAnsi="Courier New" w:hint="default"/>
+        <w:sz w:val="20"/>
+      </w:rPr>
+    </w:lvl>
+    <w:lvl w:ilvl="2" w:tentative="1">
+      <w:start w:val="1"/>
+      <w:numFmt w:val="bullet"/>
+      <w:lvlText w:val=""/>
+      <w:lvlJc w:val="left"/>
+      <w:pPr>
+        <w:tabs>
+          <w:tab w:val="num" w:pos="2160"/>
+        </w:tabs>
+        <w:ind w:left="2160" w:hanging="360"/>
+      </w:pPr>
+      <w:rPr>
+        <w:rFonts w:ascii="Wingdings" w:hAnsi="Wingdings" w:hint="default"/>
+        <w:sz w:val="20"/>
+      </w:rPr>
+    </w:lvl>
+    <w:lvl w:ilvl="3" w:tentative="1">
+      <w:start w:val="1"/>
+      <w:numFmt w:val="bullet"/>
+      <w:lvlText w:val=""/>
+      <w:lvlJc w:val="left"/>
+      <w:pPr>
+        <w:tabs>
+          <w:tab w:val="num" w:pos="2880"/>
+        </w:tabs>
+        <w:ind w:left="2880" w:hanging="360"/>
+      </w:pPr>
+      <w:rPr>
+        <w:rFonts w:ascii="Wingdings" w:hAnsi="Wingdings" w:hint="default"/>
+        <w:sz w:val="20"/>
+      </w:rPr>
+    </w:lvl>
+    <w:lvl w:ilvl="4" w:tentative="1">
+      <w:start w:val="1"/>
+      <w:numFmt w:val="bullet"/>
+      <w:lvlText w:val=""/>
+      <w:lvlJc w:val="left"/>
+      <w:pPr>
+        <w:tabs>
+          <w:tab w:val="num" w:pos="3600"/>
+        </w:tabs>
+        <w:ind w:left="3600" w:hanging="360"/>
+      </w:pPr>
+      <w:rPr>
+        <w:rFonts w:ascii="Wingdings" w:hAnsi="Wingdings" w:hint="default"/>
+        <w:sz w:val="20"/>
+      </w:rPr>
+    </w:lvl>
+    <w:lvl w:ilvl="5" w:tentative="1">
+      <w:start w:val="1"/>
+      <w:numFmt w:val="bullet"/>
+      <w:lvlText w:val=""/>
+      <w:lvlJc w:val="left"/>
+      <w:pPr>
+        <w:tabs>
+          <w:tab w:val="num" w:pos="4320"/>
+        </w:tabs>
+        <w:ind w:left="4320" w:hanging="360"/>
+      </w:pPr>
+      <w:rPr>
+        <w:rFonts w:ascii="Wingdings" w:hAnsi="Wingdings" w:hint="default"/>
+        <w:sz w:val="20"/>
+      </w:rPr>
+    </w:lvl>
+    <w:lvl w:ilvl="6" w:tentative="1">
+      <w:start w:val="1"/>
+      <w:numFmt w:val="bullet"/>
+      <w:lvlText w:val=""/>
+      <w:lvlJc w:val="left"/>
+      <w:pPr>
+        <w:tabs>
+          <w:tab w:val="num" w:pos="5040"/>
+        </w:tabs>
+        <w:ind w:left="5040" w:hanging="360"/>
+      </w:pPr>
+      <w:rPr>
+        <w:rFonts w:ascii="Wingdings" w:hAnsi="Wingdings" w:hint="default"/>
+        <w:sz w:val="20"/>
+      </w:rPr>
+    </w:lvl>
+    <w:lvl w:ilvl="7" w:tentative="1">
+      <w:start w:val="1"/>
+      <w:numFmt w:val="bullet"/>
+      <w:lvlText w:val=""/>
+      <w:lvlJc w:val="left"/>
+      <w:pPr>
+        <w:tabs>
+          <w:tab w:val="num" w:pos="5760"/>
+        </w:tabs>
+        <w:ind w:left="5760" w:hanging="360"/>
+      </w:pPr>
+      <w:rPr>
+        <w:rFonts w:ascii="Wingdings" w:hAnsi="Wingdings" w:hint="default"/>
+        <w:sz w:val="20"/>
+      </w:rPr>
+    </w:lvl>
+    <w:lvl w:ilvl="8" w:tentative="1">
+      <w:start w:val="1"/>
+      <w:numFmt w:val="bullet"/>
+      <w:lvlText w:val=""/>
+      <w:lvlJc w:val="left"/>
+      <w:pPr>
+        <w:tabs>
+          <w:tab w:val="num" w:pos="6480"/>
+        </w:tabs>
+        <w:ind w:left="6480" w:hanging="360"/>
+      </w:pPr>
+      <w:rPr>
+        <w:rFonts w:ascii="Wingdings" w:hAnsi="Wingdings" w:hint="default"/>
+        <w:sz w:val="20"/>
+      </w:rPr>
+    </w:lvl>
+  </w:abstractNum>
+  <w:abstractNum w:abstractNumId="12" w15:restartNumberingAfterBreak="0">
+    <w:nsid w:val="49284529"/>
+    <w:multiLevelType w:val="multilevel"/>
+    <w:tmpl w:val="EE7E110C"/>
+    <w:lvl w:ilvl="0">
+      <w:start w:val="3"/>
+      <w:numFmt w:val="decimal"/>
+      <w:lvlText w:val="%1."/>
+      <w:lvlJc w:val="left"/>
+      <w:pPr>
+        <w:tabs>
+          <w:tab w:val="num" w:pos="720"/>
+        </w:tabs>
+        <w:ind w:left="720" w:hanging="360"/>
+      </w:pPr>
+    </w:lvl>
+    <w:lvl w:ilvl="1" w:tentative="1">
+      <w:start w:val="1"/>
+      <w:numFmt w:val="decimal"/>
+      <w:lvlText w:val="%2."/>
+      <w:lvlJc w:val="left"/>
+      <w:pPr>
+        <w:tabs>
+          <w:tab w:val="num" w:pos="1440"/>
+        </w:tabs>
+        <w:ind w:left="1440" w:hanging="360"/>
+      </w:pPr>
+    </w:lvl>
+    <w:lvl w:ilvl="2" w:tentative="1">
+      <w:start w:val="1"/>
+      <w:numFmt w:val="decimal"/>
+      <w:lvlText w:val="%3."/>
+      <w:lvlJc w:val="left"/>
+      <w:pPr>
+        <w:tabs>
+          <w:tab w:val="num" w:pos="2160"/>
+        </w:tabs>
+        <w:ind w:left="2160" w:hanging="360"/>
+      </w:pPr>
+    </w:lvl>
+    <w:lvl w:ilvl="3" w:tentative="1">
+      <w:start w:val="1"/>
+      <w:numFmt w:val="decimal"/>
+      <w:lvlText w:val="%4."/>
+      <w:lvlJc w:val="left"/>
+      <w:pPr>
+        <w:tabs>
+          <w:tab w:val="num" w:pos="2880"/>
+        </w:tabs>
+        <w:ind w:left="2880" w:hanging="360"/>
+      </w:pPr>
+    </w:lvl>
+    <w:lvl w:ilvl="4" w:tentative="1">
+      <w:start w:val="1"/>
+      <w:numFmt w:val="decimal"/>
+      <w:lvlText w:val="%5."/>
+      <w:lvlJc w:val="left"/>
+      <w:pPr>
+        <w:tabs>
+          <w:tab w:val="num" w:pos="3600"/>
+        </w:tabs>
+        <w:ind w:left="3600" w:hanging="360"/>
+      </w:pPr>
+    </w:lvl>
+    <w:lvl w:ilvl="5" w:tentative="1">
+      <w:start w:val="1"/>
+      <w:numFmt w:val="decimal"/>
+      <w:lvlText w:val="%6."/>
+      <w:lvlJc w:val="left"/>
+      <w:pPr>
+        <w:tabs>
+          <w:tab w:val="num" w:pos="4320"/>
+        </w:tabs>
+        <w:ind w:left="4320" w:hanging="360"/>
+      </w:pPr>
+    </w:lvl>
+    <w:lvl w:ilvl="6" w:tentative="1">
+      <w:start w:val="1"/>
+      <w:numFmt w:val="decimal"/>
+      <w:lvlText w:val="%7."/>
+      <w:lvlJc w:val="left"/>
+      <w:pPr>
+        <w:tabs>
+          <w:tab w:val="num" w:pos="5040"/>
+        </w:tabs>
+        <w:ind w:left="5040" w:hanging="360"/>
+      </w:pPr>
+    </w:lvl>
+    <w:lvl w:ilvl="7" w:tentative="1">
+      <w:start w:val="1"/>
+      <w:numFmt w:val="decimal"/>
+      <w:lvlText w:val="%8."/>
+      <w:lvlJc w:val="left"/>
+      <w:pPr>
+        <w:tabs>
+          <w:tab w:val="num" w:pos="5760"/>
+        </w:tabs>
+        <w:ind w:left="5760" w:hanging="360"/>
+      </w:pPr>
+    </w:lvl>
+    <w:lvl w:ilvl="8" w:tentative="1">
+      <w:start w:val="1"/>
+      <w:numFmt w:val="decimal"/>
+      <w:lvlText w:val="%9."/>
+      <w:lvlJc w:val="left"/>
+      <w:pPr>
+        <w:tabs>
+          <w:tab w:val="num" w:pos="6480"/>
+        </w:tabs>
+        <w:ind w:left="6480" w:hanging="360"/>
+      </w:pPr>
+    </w:lvl>
+  </w:abstractNum>
+  <w:abstractNum w:abstractNumId="13" w15:restartNumberingAfterBreak="0">
     <w:nsid w:val="4E0714FD"/>
     <w:multiLevelType w:val="multilevel"/>
     <w:tmpl w:val="A90CC5F2"/>
@@ -5380,7 +7415,156 @@
       </w:pPr>
     </w:lvl>
   </w:abstractNum>
-  <w:abstractNum w:abstractNumId="6" w15:restartNumberingAfterBreak="0">
+  <w:abstractNum w:abstractNumId="14" w15:restartNumberingAfterBreak="0">
+    <w:nsid w:val="50C96EC5"/>
+    <w:multiLevelType w:val="multilevel"/>
+    <w:tmpl w:val="8430B61E"/>
+    <w:lvl w:ilvl="0">
+      <w:start w:val="1"/>
+      <w:numFmt w:val="bullet"/>
+      <w:lvlText w:val=""/>
+      <w:lvlJc w:val="left"/>
+      <w:pPr>
+        <w:tabs>
+          <w:tab w:val="num" w:pos="720"/>
+        </w:tabs>
+        <w:ind w:left="720" w:hanging="360"/>
+      </w:pPr>
+      <w:rPr>
+        <w:rFonts w:ascii="Symbol" w:hAnsi="Symbol" w:hint="default"/>
+        <w:sz w:val="20"/>
+      </w:rPr>
+    </w:lvl>
+    <w:lvl w:ilvl="1" w:tentative="1">
+      <w:start w:val="1"/>
+      <w:numFmt w:val="bullet"/>
+      <w:lvlText w:val="o"/>
+      <w:lvlJc w:val="left"/>
+      <w:pPr>
+        <w:tabs>
+          <w:tab w:val="num" w:pos="1440"/>
+        </w:tabs>
+        <w:ind w:left="1440" w:hanging="360"/>
+      </w:pPr>
+      <w:rPr>
+        <w:rFonts w:ascii="Courier New" w:hAnsi="Courier New" w:hint="default"/>
+        <w:sz w:val="20"/>
+      </w:rPr>
+    </w:lvl>
+    <w:lvl w:ilvl="2" w:tentative="1">
+      <w:start w:val="1"/>
+      <w:numFmt w:val="bullet"/>
+      <w:lvlText w:val=""/>
+      <w:lvlJc w:val="left"/>
+      <w:pPr>
+        <w:tabs>
+          <w:tab w:val="num" w:pos="2160"/>
+        </w:tabs>
+        <w:ind w:left="2160" w:hanging="360"/>
+      </w:pPr>
+      <w:rPr>
+        <w:rFonts w:ascii="Wingdings" w:hAnsi="Wingdings" w:hint="default"/>
+        <w:sz w:val="20"/>
+      </w:rPr>
+    </w:lvl>
+    <w:lvl w:ilvl="3" w:tentative="1">
+      <w:start w:val="1"/>
+      <w:numFmt w:val="bullet"/>
+      <w:lvlText w:val=""/>
+      <w:lvlJc w:val="left"/>
+      <w:pPr>
+        <w:tabs>
+          <w:tab w:val="num" w:pos="2880"/>
+        </w:tabs>
+        <w:ind w:left="2880" w:hanging="360"/>
+      </w:pPr>
+      <w:rPr>
+        <w:rFonts w:ascii="Wingdings" w:hAnsi="Wingdings" w:hint="default"/>
+        <w:sz w:val="20"/>
+      </w:rPr>
+    </w:lvl>
+    <w:lvl w:ilvl="4" w:tentative="1">
+      <w:start w:val="1"/>
+      <w:numFmt w:val="bullet"/>
+      <w:lvlText w:val=""/>
+      <w:lvlJc w:val="left"/>
+      <w:pPr>
+        <w:tabs>
+          <w:tab w:val="num" w:pos="3600"/>
+        </w:tabs>
+        <w:ind w:left="3600" w:hanging="360"/>
+      </w:pPr>
+      <w:rPr>
+        <w:rFonts w:ascii="Wingdings" w:hAnsi="Wingdings" w:hint="default"/>
+        <w:sz w:val="20"/>
+      </w:rPr>
+    </w:lvl>
+    <w:lvl w:ilvl="5" w:tentative="1">
+      <w:start w:val="1"/>
+      <w:numFmt w:val="bullet"/>
+      <w:lvlText w:val=""/>
+      <w:lvlJc w:val="left"/>
+      <w:pPr>
+        <w:tabs>
+          <w:tab w:val="num" w:pos="4320"/>
+        </w:tabs>
+        <w:ind w:left="4320" w:hanging="360"/>
+      </w:pPr>
+      <w:rPr>
+        <w:rFonts w:ascii="Wingdings" w:hAnsi="Wingdings" w:hint="default"/>
+        <w:sz w:val="20"/>
+      </w:rPr>
+    </w:lvl>
+    <w:lvl w:ilvl="6" w:tentative="1">
+      <w:start w:val="1"/>
+      <w:numFmt w:val="bullet"/>
+      <w:lvlText w:val=""/>
+      <w:lvlJc w:val="left"/>
+      <w:pPr>
+        <w:tabs>
+          <w:tab w:val="num" w:pos="5040"/>
+        </w:tabs>
+        <w:ind w:left="5040" w:hanging="360"/>
+      </w:pPr>
+      <w:rPr>
+        <w:rFonts w:ascii="Wingdings" w:hAnsi="Wingdings" w:hint="default"/>
+        <w:sz w:val="20"/>
+      </w:rPr>
+    </w:lvl>
+    <w:lvl w:ilvl="7" w:tentative="1">
+      <w:start w:val="1"/>
+      <w:numFmt w:val="bullet"/>
+      <w:lvlText w:val=""/>
+      <w:lvlJc w:val="left"/>
+      <w:pPr>
+        <w:tabs>
+          <w:tab w:val="num" w:pos="5760"/>
+        </w:tabs>
+        <w:ind w:left="5760" w:hanging="360"/>
+      </w:pPr>
+      <w:rPr>
+        <w:rFonts w:ascii="Wingdings" w:hAnsi="Wingdings" w:hint="default"/>
+        <w:sz w:val="20"/>
+      </w:rPr>
+    </w:lvl>
+    <w:lvl w:ilvl="8" w:tentative="1">
+      <w:start w:val="1"/>
+      <w:numFmt w:val="bullet"/>
+      <w:lvlText w:val=""/>
+      <w:lvlJc w:val="left"/>
+      <w:pPr>
+        <w:tabs>
+          <w:tab w:val="num" w:pos="6480"/>
+        </w:tabs>
+        <w:ind w:left="6480" w:hanging="360"/>
+      </w:pPr>
+      <w:rPr>
+        <w:rFonts w:ascii="Wingdings" w:hAnsi="Wingdings" w:hint="default"/>
+        <w:sz w:val="20"/>
+      </w:rPr>
+    </w:lvl>
+  </w:abstractNum>
+  <w:abstractNum w:abstractNumId="15" w15:restartNumberingAfterBreak="0">
     <w:nsid w:val="52D4450F"/>
     <w:multiLevelType w:val="multilevel"/>
     <w:tmpl w:val="0A12A470"/>
@@ -5497,7 +7681,7 @@
       </w:pPr>
     </w:lvl>
   </w:abstractNum>
-  <w:abstractNum w:abstractNumId="7" w15:restartNumberingAfterBreak="0">
+  <w:abstractNum w:abstractNumId="16" w15:restartNumberingAfterBreak="0">
     <w:nsid w:val="52DD2CC6"/>
     <w:multiLevelType w:val="multilevel"/>
     <w:tmpl w:val="E532442C"/>
@@ -5614,7 +7798,120 @@
       </w:pPr>
     </w:lvl>
   </w:abstractNum>
-  <w:abstractNum w:abstractNumId="8" w15:restartNumberingAfterBreak="0">
+  <w:abstractNum w:abstractNumId="17" w15:restartNumberingAfterBreak="0">
+    <w:nsid w:val="55811052"/>
+    <w:multiLevelType w:val="multilevel"/>
+    <w:tmpl w:val="83725000"/>
+    <w:lvl w:ilvl="0">
+      <w:start w:val="1"/>
+      <w:numFmt w:val="decimal"/>
+      <w:lvlText w:val="%1."/>
+      <w:lvlJc w:val="left"/>
+      <w:pPr>
+        <w:tabs>
+          <w:tab w:val="num" w:pos="720"/>
+        </w:tabs>
+        <w:ind w:left="720" w:hanging="360"/>
+      </w:pPr>
+    </w:lvl>
+    <w:lvl w:ilvl="1" w:tentative="1">
+      <w:start w:val="1"/>
+      <w:numFmt w:val="decimal"/>
+      <w:lvlText w:val="%2."/>
+      <w:lvlJc w:val="left"/>
+      <w:pPr>
+        <w:tabs>
+          <w:tab w:val="num" w:pos="1440"/>
+        </w:tabs>
+        <w:ind w:left="1440" w:hanging="360"/>
+      </w:pPr>
+    </w:lvl>
+    <w:lvl w:ilvl="2" w:tentative="1">
+      <w:start w:val="1"/>
+      <w:numFmt w:val="decimal"/>
+      <w:lvlText w:val="%3."/>
+      <w:lvlJc w:val="left"/>
+      <w:pPr>
+        <w:tabs>
+          <w:tab w:val="num" w:pos="2160"/>
+        </w:tabs>
+        <w:ind w:left="2160" w:hanging="360"/>
+      </w:pPr>
+    </w:lvl>
+    <w:lvl w:ilvl="3" w:tentative="1">
+      <w:start w:val="1"/>
+      <w:numFmt w:val="decimal"/>
+      <w:lvlText w:val="%4."/>
+      <w:lvlJc w:val="left"/>
+      <w:pPr>
+        <w:tabs>
+          <w:tab w:val="num" w:pos="2880"/>
+        </w:tabs>
+        <w:ind w:left="2880" w:hanging="360"/>
+      </w:pPr>
+    </w:lvl>
+    <w:lvl w:ilvl="4" w:tentative="1">
+      <w:start w:val="1"/>
+      <w:numFmt w:val="decimal"/>
+      <w:lvlText w:val="%5."/>
+      <w:lvlJc w:val="left"/>
+      <w:pPr>
+        <w:tabs>
+          <w:tab w:val="num" w:pos="3600"/>
+        </w:tabs>
+        <w:ind w:left="3600" w:hanging="360"/>
+      </w:pPr>
+    </w:lvl>
+    <w:lvl w:ilvl="5" w:tentative="1">
+      <w:start w:val="1"/>
+      <w:numFmt w:val="decimal"/>
+      <w:lvlText w:val="%6."/>
+      <w:lvlJc w:val="left"/>
+      <w:pPr>
+        <w:tabs>
+          <w:tab w:val="num" w:pos="4320"/>
+        </w:tabs>
+        <w:ind w:left="4320" w:hanging="360"/>
+      </w:pPr>
+    </w:lvl>
+    <w:lvl w:ilvl="6" w:tentative="1">
+      <w:start w:val="1"/>
+      <w:numFmt w:val="decimal"/>
+      <w:lvlText w:val="%7."/>
+      <w:lvlJc w:val="left"/>
+      <w:pPr>
+        <w:tabs>
+          <w:tab w:val="num" w:pos="5040"/>
+        </w:tabs>
+        <w:ind w:left="5040" w:hanging="360"/>
+      </w:pPr>
+    </w:lvl>
+    <w:lvl w:ilvl="7" w:tentative="1">
+      <w:start w:val="1"/>
+      <w:numFmt w:val="decimal"/>
+      <w:lvlText w:val="%8."/>
+      <w:lvlJc w:val="left"/>
+      <w:pPr>
+        <w:tabs>
+          <w:tab w:val="num" w:pos="5760"/>
+        </w:tabs>
+        <w:ind w:left="5760" w:hanging="360"/>
+      </w:pPr>
+    </w:lvl>
+    <w:lvl w:ilvl="8" w:tentative="1">
+      <w:start w:val="1"/>
+      <w:numFmt w:val="decimal"/>
+      <w:lvlText w:val="%9."/>
+      <w:lvlJc w:val="left"/>
+      <w:pPr>
+        <w:tabs>
+          <w:tab w:val="num" w:pos="6480"/>
+        </w:tabs>
+        <w:ind w:left="6480" w:hanging="360"/>
+      </w:pPr>
+    </w:lvl>
+  </w:abstractNum>
+  <w:abstractNum w:abstractNumId="18" w15:restartNumberingAfterBreak="0">
     <w:nsid w:val="61EE354D"/>
     <w:multiLevelType w:val="multilevel"/>
     <w:tmpl w:val="F29272AE"/>
@@ -5731,32 +8028,178 @@
       </w:pPr>
     </w:lvl>
   </w:abstractNum>
+  <w:abstractNum w:abstractNumId="19" w15:restartNumberingAfterBreak="0">
+    <w:nsid w:val="6E5347F5"/>
+    <w:multiLevelType w:val="multilevel"/>
+    <w:tmpl w:val="AE8EF9E4"/>
+    <w:lvl w:ilvl="0">
+      <w:start w:val="2"/>
+      <w:numFmt w:val="decimal"/>
+      <w:lvlText w:val="%1."/>
+      <w:lvlJc w:val="left"/>
+      <w:pPr>
+        <w:tabs>
+          <w:tab w:val="num" w:pos="720"/>
+        </w:tabs>
+        <w:ind w:left="720" w:hanging="360"/>
+      </w:pPr>
+    </w:lvl>
+    <w:lvl w:ilvl="1" w:tentative="1">
+      <w:start w:val="1"/>
+      <w:numFmt w:val="decimal"/>
+      <w:lvlText w:val="%2."/>
+      <w:lvlJc w:val="left"/>
+      <w:pPr>
+        <w:tabs>
+          <w:tab w:val="num" w:pos="1440"/>
+        </w:tabs>
+        <w:ind w:left="1440" w:hanging="360"/>
+      </w:pPr>
+    </w:lvl>
+    <w:lvl w:ilvl="2" w:tentative="1">
+      <w:start w:val="1"/>
+      <w:numFmt w:val="decimal"/>
+      <w:lvlText w:val="%3."/>
+      <w:lvlJc w:val="left"/>
+      <w:pPr>
+        <w:tabs>
+          <w:tab w:val="num" w:pos="2160"/>
+        </w:tabs>
+        <w:ind w:left="2160" w:hanging="360"/>
+      </w:pPr>
+    </w:lvl>
+    <w:lvl w:ilvl="3" w:tentative="1">
+      <w:start w:val="1"/>
+      <w:numFmt w:val="decimal"/>
+      <w:lvlText w:val="%4."/>
+      <w:lvlJc w:val="left"/>
+      <w:pPr>
+        <w:tabs>
+          <w:tab w:val="num" w:pos="2880"/>
+        </w:tabs>
+        <w:ind w:left="2880" w:hanging="360"/>
+      </w:pPr>
+    </w:lvl>
+    <w:lvl w:ilvl="4" w:tentative="1">
+      <w:start w:val="1"/>
+      <w:numFmt w:val="decimal"/>
+      <w:lvlText w:val="%5."/>
+      <w:lvlJc w:val="left"/>
+      <w:pPr>
+        <w:tabs>
+          <w:tab w:val="num" w:pos="3600"/>
+        </w:tabs>
+        <w:ind w:left="3600" w:hanging="360"/>
+      </w:pPr>
+    </w:lvl>
+    <w:lvl w:ilvl="5" w:tentative="1">
+      <w:start w:val="1"/>
+      <w:numFmt w:val="decimal"/>
+      <w:lvlText w:val="%6."/>
+      <w:lvlJc w:val="left"/>
+      <w:pPr>
+        <w:tabs>
+          <w:tab w:val="num" w:pos="4320"/>
+        </w:tabs>
+        <w:ind w:left="4320" w:hanging="360"/>
+      </w:pPr>
+    </w:lvl>
+    <w:lvl w:ilvl="6" w:tentative="1">
+      <w:start w:val="1"/>
+      <w:numFmt w:val="decimal"/>
+      <w:lvlText w:val="%7."/>
+      <w:lvlJc w:val="left"/>
+      <w:pPr>
+        <w:tabs>
+          <w:tab w:val="num" w:pos="5040"/>
+        </w:tabs>
+        <w:ind w:left="5040" w:hanging="360"/>
+      </w:pPr>
+    </w:lvl>
+    <w:lvl w:ilvl="7" w:tentative="1">
+      <w:start w:val="1"/>
+      <w:numFmt w:val="decimal"/>
+      <w:lvlText w:val="%8."/>
+      <w:lvlJc w:val="left"/>
+      <w:pPr>
+        <w:tabs>
+          <w:tab w:val="num" w:pos="5760"/>
+        </w:tabs>
+        <w:ind w:left="5760" w:hanging="360"/>
+      </w:pPr>
+    </w:lvl>
+    <w:lvl w:ilvl="8" w:tentative="1">
+      <w:start w:val="1"/>
+      <w:numFmt w:val="decimal"/>
+      <w:lvlText w:val="%9."/>
+      <w:lvlJc w:val="left"/>
+      <w:pPr>
+        <w:tabs>
+          <w:tab w:val="num" w:pos="6480"/>
+        </w:tabs>
+        <w:ind w:left="6480" w:hanging="360"/>
+      </w:pPr>
+    </w:lvl>
+  </w:abstractNum>
   <w:num w:numId="1">
+    <w:abstractNumId w:val="9"/>
+  </w:num>
+  <w:num w:numId="2">
+    <w:abstractNumId w:val="15"/>
+  </w:num>
+  <w:num w:numId="3">
+    <w:abstractNumId w:val="18"/>
+  </w:num>
+  <w:num w:numId="4">
+    <w:abstractNumId w:val="2"/>
+  </w:num>
+  <w:num w:numId="5">
+    <w:abstractNumId w:val="13"/>
+  </w:num>
+  <w:num w:numId="6">
+    <w:abstractNumId w:val="6"/>
+  </w:num>
+  <w:num w:numId="7">
+    <w:abstractNumId w:val="16"/>
+  </w:num>
+  <w:num w:numId="8">
+    <w:abstractNumId w:val="10"/>
+  </w:num>
+  <w:num w:numId="9">
+    <w:abstractNumId w:val="5"/>
+  </w:num>
+  <w:num w:numId="10">
+    <w:abstractNumId w:val="1"/>
+  </w:num>
+  <w:num w:numId="11">
+    <w:abstractNumId w:val="19"/>
+  </w:num>
+  <w:num w:numId="12">
     <w:abstractNumId w:val="3"/>
   </w:num>
-  <w:num w:numId="2">
-    <w:abstractNumId w:val="6"/>
+  <w:num w:numId="13">
+    <w:abstractNumId w:val="17"/>
   </w:num>
-  <w:num w:numId="3">
-    <w:abstractNumId w:val="8"/>
+  <w:num w:numId="14">
+    <w:abstractNumId w:val="14"/>
   </w:num>
-  <w:num w:numId="4">
+  <w:num w:numId="15">
+    <w:abstractNumId w:val="4"/>
+  </w:num>
+  <w:num w:numId="16">
     <w:abstractNumId w:val="0"/>
   </w:num>
-  <w:num w:numId="5">
-    <w:abstractNumId w:val="5"/>
+  <w:num w:numId="17">
+    <w:abstractNumId w:val="12"/>
   </w:num>
-  <w:num w:numId="6">
-    <w:abstractNumId w:val="2"/>
-  </w:num>
-  <w:num w:numId="7">
+  <w:num w:numId="18">
     <w:abstractNumId w:val="7"/>
   </w:num>
-  <w:num w:numId="8">
-    <w:abstractNumId w:val="4"/>
+  <w:num w:numId="19">
+    <w:abstractNumId w:val="11"/>
   </w:num>
-  <w:num w:numId="9">
-    <w:abstractNumId w:val="1"/>
+  <w:num w:numId="20">
+    <w:abstractNumId w:val="8"/>
   </w:num>
 </w:numbering>
 </file>
@@ -6261,7 +8704,6 @@
     <w:name w:val="Normal (Web)"/>
     <w:basedOn w:val="a"/>
     <w:uiPriority w:val="99"/>
-    <w:semiHidden/>
     <w:unhideWhenUsed/>
     <w:rsid w:val="008826B7"/>
     <w:pPr>

</xml_diff>